<commit_message>
fix: resolve upside-down image orientations and purge old links with updated URLs
</commit_message>
<xml_diff>
--- a/AceAI_Badminton_Coach_Design_Thinking_Report.docx
+++ b/AceAI_Badminton_Coach_Design_Thinking_Report.docx
@@ -98,8 +98,6 @@
         <w:tab/>
         <w:t xml:space="preserve">i</w:t>
       </w:r>
-      <w:proofErr w:type="spellStart"/>
-      <w:proofErr w:type="spellEnd"/>
     </w:p>
     <w:p>
       <w:pPr>
@@ -565,7 +563,12 @@
           <w:szCs w:val="26"/>
         </w:rPr>
       </w:pPr>
-      <w:r/>
+      <w:r>
+        <w:rPr>
+          <w:sz w:val="26"/>
+          <w:szCs w:val="26"/>
+        </w:rPr>
+      </w:r>
     </w:p>
     <w:p>
       <w:pPr>
@@ -1782,8 +1785,6 @@
         <w:tab/>
         <w:t xml:space="preserve">21</w:t>
       </w:r>
-      <w:proofErr w:type="spellStart"/>
-      <w:proofErr w:type="spellEnd"/>
     </w:p>
     <w:p>
       <w:pPr>
@@ -2351,8 +2352,6 @@
         <w:tab/>
         <w:t xml:space="preserve">User Experience</w:t>
       </w:r>
-      <w:proofErr w:type="spellStart"/>
-      <w:proofErr w:type="spellEnd"/>
     </w:p>
     <w:p>
       <w:pPr>
@@ -2449,11 +2448,9 @@
         <w:keepNext/>
         <w:spacing w:before="240" w:after="160" w:line="360" w:lineRule="auto"/>
       </w:pPr>
-      <w:proofErr w:type="gramStart"/>
       <w:r>
         <w:t xml:space="preserve">1.1  Background and Motivation</w:t>
       </w:r>
-      <w:proofErr w:type="gramEnd"/>
     </w:p>
     <w:p>
       <w:pPr>
@@ -2472,8 +2469,6 @@
       <w:r>
         <w:t xml:space="preserve">Despite the sport's widespread popularity across recreational clubs, collegiate teams, and national training academies, the vast majority of badminton athletes lack access to objective, data-driven biomechanical telemetry. In conventional training environments, players rely almost exclusively on qualitative human coaching. While experienced coaches offer valuable tactical guidance, human visual perception cannot resolve microsecond kinematic breakdowns, such as a 12-degree premature elbow collapse or an uncoordinated hip lead timing. Furthermore, high-performance one-on-one coaching commands steep hourly rates ($60–$120/hr), placing elite training out of reach for junior, grassroots, and self-funded athletes.</w:t>
       </w:r>
-      <w:proofErr w:type="spellStart"/>
-      <w:proofErr w:type="spellEnd"/>
     </w:p>
     <w:p>
       <w:pPr>
@@ -2508,11 +2503,9 @@
         <w:keepNext/>
         <w:spacing w:before="240" w:after="160" w:line="360" w:lineRule="auto"/>
       </w:pPr>
-      <w:proofErr w:type="gramStart"/>
       <w:r>
         <w:t xml:space="preserve">1.2  Design Thinking Approach – An Overview</w:t>
       </w:r>
-      <w:proofErr w:type="gramEnd"/>
     </w:p>
     <w:p>
       <w:pPr>
@@ -2687,11 +2680,9 @@
         <w:keepNext/>
         <w:spacing w:before="240" w:after="160" w:line="360" w:lineRule="auto"/>
       </w:pPr>
-      <w:proofErr w:type="gramStart"/>
       <w:r>
         <w:t xml:space="preserve">1.3  Objectives of the Project</w:t>
       </w:r>
-      <w:proofErr w:type="gramEnd"/>
     </w:p>
     <w:p>
       <w:pPr>
@@ -2778,11 +2769,9 @@
         <w:keepNext/>
         <w:spacing w:before="240" w:after="160" w:line="360" w:lineRule="auto"/>
       </w:pPr>
-      <w:proofErr w:type="gramStart"/>
       <w:r>
         <w:t xml:space="preserve">1.4  Scope of the Project</w:t>
       </w:r>
-      <w:proofErr w:type="gramEnd"/>
     </w:p>
     <w:p>
       <w:pPr>
@@ -2808,11 +2797,9 @@
         <w:keepNext/>
         <w:spacing w:before="240" w:after="160" w:line="360" w:lineRule="auto"/>
       </w:pPr>
-      <w:proofErr w:type="gramStart"/>
       <w:r>
         <w:t xml:space="preserve">1.5  Organisation of the Report</w:t>
       </w:r>
-      <w:proofErr w:type="gramEnd"/>
     </w:p>
     <w:p>
       <w:pPr>
@@ -2822,8 +2809,6 @@
       <w:r>
         <w:t xml:space="preserve">This report is organized into nine sequential chapters adhering to academic design thinking documentation standards. Chapter 1 introduces the problem domain, motivation, design thinking methodology, objectives, and scope. Chapter 2 presents a comparative study of existing sports coaching products and identifies critical technical gaps. Chapter 3 details the Empathize phase, user personas, and empathy maps. Chapter 4 frames the core engineering problem using canvases and HMW statements. Chapter 5 explores ideation techniques (SCAMPER, Crazy 8's) and concept screening. Chapter 6 elaborates on the system architecture, mathematical formulas, and software implementation. Chapter 7 documents experimental testing, goniometric validation, user feedback, and TRL assessment. Chapter 8 evaluates societal impact, UN SDG alignment, and sustainable deployment models. Chapter 9 concludes the study and outlines future research directions, followed by academic references, annexure project sheets, and technical appendices.</w:t>
       </w:r>
-      <w:proofErr w:type="gramStart"/>
-      <w:proofErr w:type="gramEnd"/>
     </w:p>
     <w:p>
       <w:pPr>
@@ -2854,11 +2839,9 @@
         <w:keepNext/>
         <w:spacing w:before="240" w:after="160" w:line="360" w:lineRule="auto"/>
       </w:pPr>
-      <w:proofErr w:type="gramStart"/>
       <w:r>
         <w:t xml:space="preserve">2.1  Existing Products / Solutions</w:t>
       </w:r>
-      <w:proofErr w:type="gramEnd"/>
     </w:p>
     <w:p>
       <w:pPr>
@@ -2875,6 +2858,10 @@
         <w:jc w:val="both"/>
       </w:pPr>
       <w:r>
+        <w:rPr>
+          <w:b/>
+          <w:bCs/>
+        </w:rPr>
         <w:t xml:space="preserve">1. Conventional In-Person Private Coaching: The traditional gold standard in athletic development involves direct one-on-one instruction from a certified coach. While providing personalized encouragement and tactical drills, human coaches cannot visually resolve multi-joint velocities occurring in milliseconds, cannot offer quantitative telemetry (e.g. precise elbow degree or kinetic chain delay), and represent a prohibitive recurring cost ($50–$120 per hour) unavailable to most amateur athletes.</w:t>
       </w:r>
     </w:p>
@@ -2884,6 +2871,10 @@
         <w:jc w:val="both"/>
       </w:pPr>
       <w:r>
+        <w:rPr>
+          <w:b/>
+          <w:bCs/>
+        </w:rPr>
         <w:t xml:space="preserve">2. Racket-Mounted Wearable IMU Sensors: Commercial smart sensor modules (such as the USense or Zepp Badminton sensor) clip onto the racket handle butt cap. These devices utilize multi-axis accelerometers and gyroscopes to record swing counts, impact force, and racket rotation speed. However, athletes universally report that adding 8–12 grams to the handle alters racket swing-weight and balance, dampens wrist whip, and completely fails to track body kinematics, hip rotation, knee bend, or player footwork positioning.</w:t>
       </w:r>
     </w:p>
@@ -2893,6 +2884,10 @@
         <w:jc w:val="both"/>
       </w:pPr>
       <w:r>
+        <w:rPr>
+          <w:b/>
+          <w:bCs/>
+        </w:rPr>
         <w:t xml:space="preserve">3. Retrospective Video Analysis Platforms: Software tools such as Dartfish, Coach's Eye, and Kinovea allow players to record training videos and manually annotate joint angles post-session. While highly informative for elite debriefing, these platforms require tedious frame-by-frame manual scrubbing, offer zero real-time intervention while the player is on court, and fail to provide immediate muscle memory reinforcement.</w:t>
       </w:r>
     </w:p>
@@ -2902,6 +2897,10 @@
         <w:jc w:val="both"/>
       </w:pPr>
       <w:r>
+        <w:rPr>
+          <w:b/>
+          <w:bCs/>
+        </w:rPr>
         <w:t xml:space="preserve">4. Specialized Optical Motion Capture Laboratories: High-end sports biomechanics laboratories utilize multi-camera infrared marker systems (such as Vicon and Qualisys) operating at 240–500 FPS. While delivering sub-millimeter 3D spatial precision, these setups cost upwards of $50,000, demand laboratory confinement with artificial boundary markers, require adhesive body sensors that restrict natural athlete movement, and take hours of post-processing before generating report data.</w:t>
       </w:r>
     </w:p>
@@ -4068,11 +4067,9 @@
         <w:keepNext/>
         <w:spacing w:before="240" w:after="160" w:line="360" w:lineRule="auto"/>
       </w:pPr>
-      <w:proofErr w:type="gramStart"/>
       <w:r>
         <w:t xml:space="preserve">2.2  Gaps Identified</w:t>
       </w:r>
-      <w:proofErr w:type="gramEnd"/>
     </w:p>
     <w:p>
       <w:pPr>
@@ -4159,11 +4156,9 @@
         <w:keepNext/>
         <w:spacing w:before="240" w:after="160" w:line="360" w:lineRule="auto"/>
       </w:pPr>
-      <w:proofErr w:type="gramStart"/>
       <w:r>
         <w:t xml:space="preserve">2.3  Summary</w:t>
       </w:r>
-      <w:proofErr w:type="gramEnd"/>
     </w:p>
     <w:p>
       <w:pPr>
@@ -4203,11 +4198,9 @@
         <w:keepNext/>
         <w:spacing w:before="240" w:after="160" w:line="360" w:lineRule="auto"/>
       </w:pPr>
-      <w:proofErr w:type="gramStart"/>
       <w:r>
         <w:t xml:space="preserve">3.1  User Identification</w:t>
       </w:r>
-      <w:proofErr w:type="gramEnd"/>
     </w:p>
     <w:p>
       <w:pPr>
@@ -4759,11 +4752,9 @@
         <w:keepNext/>
         <w:spacing w:before="240" w:after="160" w:line="360" w:lineRule="auto"/>
       </w:pPr>
-      <w:proofErr w:type="gramStart"/>
       <w:r>
         <w:t xml:space="preserve">3.2  User Research Methods</w:t>
       </w:r>
-      <w:proofErr w:type="gramEnd"/>
     </w:p>
     <w:p>
       <w:pPr>
@@ -4780,11 +4771,9 @@
         <w:keepNext/>
         <w:spacing w:before="120" w:after="160" w:line="360" w:lineRule="auto"/>
       </w:pPr>
-      <w:proofErr w:type="gramStart"/>
       <w:r>
         <w:t xml:space="preserve">3.2.1  User Context and Needs</w:t>
       </w:r>
-      <w:proofErr w:type="gramEnd"/>
     </w:p>
     <w:p>
       <w:pPr>
@@ -4794,12 +4783,6 @@
       <w:r>
         <w:t xml:space="preserve">Key research prompts and the corresponding technical insights derived from athletic stakeholders are outlined below:</w:t>
       </w:r>
-      <w:proofErr w:type="spellStart"/>
-      <w:proofErr w:type="spellEnd"/>
-      <w:proofErr w:type="spellStart"/>
-      <w:proofErr w:type="spellEnd"/>
-      <w:proofErr w:type="spellStart"/>
-      <w:proofErr w:type="spellEnd"/>
     </w:p>
     <w:p>
       <w:pPr>
@@ -5427,15 +5410,10 @@
                 <w:color w:val="0070C0"/>
               </w:rPr>
             </w:pPr>
-            <w:hyperlink r:id="rId9" w:history="1">
-              <w:r>
-                <w:rPr>
-                  <w:rStyle w:val="Hyperlink"/>
-                </w:rPr>
-                <w:t>https://drive.google.com/file/d/14_71XvkWBuKz5Mg9fpg9Ts1TsA_rXpt_/view?usp=sharing</w:t>
-              </w:r>
-            </w:hyperlink>
-            <w:r>
+            <w:r>
+              <w:rPr>
+                <w:color w:val="0070C0"/>
+              </w:rPr>
               <w:t xml:space="preserve">AceAI Project Google Drive Demonstration Video &amp; Architecture Portal: https://drive.google.com/file/d/11Bh4mi2BMfjptMPx0DiyxvauRImfQfLy/view?usp=drive_link</w:t>
               <w:br/>
               <w:t xml:space="preserve">Official GitHub Repository: https://github.com/abhisheikraja2007-droid/DT---Batminton</w:t>
@@ -5465,11 +5443,9 @@
         <w:keepNext/>
         <w:spacing w:before="240" w:after="160" w:line="360" w:lineRule="auto"/>
       </w:pPr>
-      <w:proofErr w:type="gramStart"/>
       <w:r>
         <w:t xml:space="preserve">3.3  Empathy Map</w:t>
       </w:r>
-      <w:proofErr w:type="gramEnd"/>
     </w:p>
     <w:p>
       <w:pPr>
@@ -6017,11 +5993,9 @@
         <w:keepNext/>
         <w:spacing w:before="240" w:after="160" w:line="360" w:lineRule="auto"/>
       </w:pPr>
-      <w:proofErr w:type="gramStart"/>
       <w:r>
         <w:t xml:space="preserve">3.4  Key Insights</w:t>
       </w:r>
-      <w:proofErr w:type="gramEnd"/>
     </w:p>
     <w:p>
       <w:pPr>
@@ -6131,11 +6105,9 @@
         <w:keepNext/>
         <w:spacing w:before="240" w:after="160" w:line="360" w:lineRule="auto"/>
       </w:pPr>
-      <w:proofErr w:type="gramStart"/>
       <w:r>
         <w:t xml:space="preserve">4.1  Problem Statement Canvas</w:t>
       </w:r>
-      <w:proofErr w:type="gramEnd"/>
     </w:p>
     <w:p>
       <w:pPr>
@@ -6856,11 +6828,9 @@
         <w:keepNext/>
         <w:spacing w:before="240" w:after="160" w:line="360" w:lineRule="auto"/>
       </w:pPr>
-      <w:proofErr w:type="gramStart"/>
       <w:r>
         <w:t xml:space="preserve">4.2  How Might We (HMW) Statements</w:t>
       </w:r>
-      <w:proofErr w:type="gramEnd"/>
     </w:p>
     <w:p>
       <w:pPr>
@@ -6991,11 +6961,9 @@
         <w:keepNext/>
         <w:spacing w:before="240" w:after="160" w:line="360" w:lineRule="auto"/>
       </w:pPr>
-      <w:proofErr w:type="gramStart"/>
       <w:r>
         <w:t xml:space="preserve">5.1  Brainstorming</w:t>
       </w:r>
-      <w:proofErr w:type="gramEnd"/>
     </w:p>
     <w:p>
       <w:pPr>
@@ -7097,11 +7065,9 @@
         <w:keepNext/>
         <w:spacing w:before="240" w:after="160" w:line="360" w:lineRule="auto"/>
       </w:pPr>
-      <w:proofErr w:type="gramStart"/>
       <w:r>
         <w:t xml:space="preserve">5.2  Ideation Techniques Used</w:t>
       </w:r>
-      <w:proofErr w:type="gramEnd"/>
     </w:p>
     <w:p>
       <w:pPr>
@@ -7118,11 +7084,9 @@
         <w:keepNext/>
         <w:spacing w:before="120" w:after="160" w:line="360" w:lineRule="auto"/>
       </w:pPr>
-      <w:proofErr w:type="gramStart"/>
       <w:r>
         <w:t xml:space="preserve">5.2.1  SCAMPER Technique</w:t>
       </w:r>
-      <w:proofErr w:type="gramEnd"/>
     </w:p>
     <w:p>
       <w:pPr>
@@ -7132,8 +7096,6 @@
       <w:r>
         <w:t xml:space="preserve">The SCAMPER framework challenged conventional assumptions across sports training hardware, resulting in the innovation matrix detailed in Table 5.1 and Figure 5.1.</w:t>
       </w:r>
-      <w:proofErr w:type="gramStart"/>
-      <w:proofErr w:type="gramEnd"/>
     </w:p>
     <w:p>
       <w:pPr>
@@ -7849,11 +7811,9 @@
         <w:keepNext/>
         <w:spacing w:before="120" w:after="160" w:line="360" w:lineRule="auto"/>
       </w:pPr>
-      <w:proofErr w:type="gramStart"/>
       <w:r>
         <w:t xml:space="preserve">5.2.2  Crazy 8’s</w:t>
       </w:r>
-      <w:proofErr w:type="gramEnd"/>
     </w:p>
     <w:p>
       <w:pPr>
@@ -8639,11 +8599,9 @@
         <w:keepNext/>
         <w:spacing w:before="240" w:after="160" w:line="360" w:lineRule="auto"/>
       </w:pPr>
-      <w:proofErr w:type="gramStart"/>
       <w:r>
         <w:t xml:space="preserve">5.3  Ideas Generated</w:t>
       </w:r>
-      <w:proofErr w:type="gramEnd"/>
     </w:p>
     <w:p>
       <w:pPr>
@@ -9172,11 +9130,9 @@
         <w:keepNext/>
         <w:spacing w:before="240" w:after="160" w:line="360" w:lineRule="auto"/>
       </w:pPr>
-      <w:proofErr w:type="gramStart"/>
       <w:r>
         <w:t xml:space="preserve">5.4  Selected Concept</w:t>
       </w:r>
-      <w:proofErr w:type="gramEnd"/>
     </w:p>
     <w:p>
       <w:pPr>
@@ -9309,11 +9265,9 @@
         <w:keepNext/>
         <w:spacing w:before="240" w:after="160" w:line="360" w:lineRule="auto"/>
       </w:pPr>
-      <w:proofErr w:type="gramStart"/>
       <w:r>
         <w:t xml:space="preserve">6.1  Prototyping Plan</w:t>
       </w:r>
-      <w:proofErr w:type="gramEnd"/>
     </w:p>
     <w:p>
       <w:pPr>
@@ -9865,11 +9819,9 @@
         <w:keepNext/>
         <w:spacing w:before="240" w:after="160" w:line="360" w:lineRule="auto"/>
       </w:pPr>
-      <w:proofErr w:type="gramStart"/>
       <w:r>
         <w:t xml:space="preserve">6.2  System Architecture / Block Diagram</w:t>
       </w:r>
-      <w:proofErr w:type="gramEnd"/>
     </w:p>
     <w:p>
       <w:pPr>
@@ -9943,8 +9895,6 @@
           <w:szCs w:val="26"/>
         </w:rPr>
       </w:r>
-      <w:proofErr w:type="spellStart"/>
-      <w:proofErr w:type="spellEnd"/>
     </w:p>
     <w:p>
       <w:pPr>
@@ -9965,8 +9915,6 @@
         </w:rPr>
         <w:t xml:space="preserve">Fig 6.1 AceAI System Architecture and Real-Time Biomechanical Pipeline</w:t>
       </w:r>
-      <w:proofErr w:type="spellStart"/>
-      <w:proofErr w:type="spellEnd"/>
     </w:p>
     <w:p>
       <w:pPr>
@@ -10007,8 +9955,6 @@
         </w:rPr>
         <w:t xml:space="preserve">Kinematic Processing &amp; Intelligence Layer: Normalized joint vectors are processed by DynamicBiomechanicalAnalysisEngine. The engine computes anatomical angles, tracks kinetic chain velocity zero-crossings, detects overhead strike zenith peaks, and emits structured StrokeAnalysisEntity records. Real-time feedback triggers sub-500 ms spoken audio cues via Android TTS, while GeminiLiveVoiceEngine manages bidirectional 16 kHz PCM WebSocket communication with Google Gemini 2.0 Flash.</w:t>
       </w:r>
-      <w:proofErr w:type="gramStart"/>
-      <w:proofErr w:type="gramEnd"/>
     </w:p>
     <w:p>
       <w:pPr>
@@ -10016,11 +9962,9 @@
         <w:keepNext/>
         <w:spacing w:before="240" w:after="160" w:line="360" w:lineRule="auto"/>
       </w:pPr>
-      <w:proofErr w:type="gramStart"/>
       <w:r>
         <w:t xml:space="preserve">6.3  Hardware and Software Requirements</w:t>
       </w:r>
-      <w:proofErr w:type="gramEnd"/>
     </w:p>
     <w:p>
       <w:pPr>
@@ -11522,11 +11466,9 @@
         <w:keepNext/>
         <w:spacing w:before="240" w:after="160" w:line="360" w:lineRule="auto"/>
       </w:pPr>
-      <w:proofErr w:type="gramStart"/>
       <w:r>
         <w:t xml:space="preserve">6.4  Design Details</w:t>
       </w:r>
-      <w:proofErr w:type="gramEnd"/>
     </w:p>
     <w:p>
       <w:pPr>
@@ -13507,11 +13449,9 @@
         <w:keepNext/>
         <w:spacing w:before="240" w:after="160" w:line="360" w:lineRule="auto"/>
       </w:pPr>
-      <w:proofErr w:type="gramStart"/>
       <w:r>
         <w:t xml:space="preserve">6.5  Implementation</w:t>
       </w:r>
-      <w:proofErr w:type="gramEnd"/>
     </w:p>
     <w:p>
       <w:pPr>
@@ -13567,11 +13507,9 @@
         <w:keepNext/>
         <w:spacing w:before="240" w:after="160" w:line="360" w:lineRule="auto"/>
       </w:pPr>
-      <w:proofErr w:type="gramStart"/>
       <w:r>
         <w:t xml:space="preserve">6.6  Cost Estimation</w:t>
       </w:r>
-      <w:proofErr w:type="gramEnd"/>
     </w:p>
     <w:p>
       <w:pPr>
@@ -14350,11 +14288,9 @@
         <w:keepNext/>
         <w:spacing w:before="240" w:after="160" w:line="360" w:lineRule="auto"/>
       </w:pPr>
-      <w:proofErr w:type="gramStart"/>
       <w:r>
         <w:t xml:space="preserve">7.1  User Testing</w:t>
       </w:r>
-      <w:proofErr w:type="gramEnd"/>
     </w:p>
     <w:p>
       <w:pPr>
@@ -15691,11 +15627,9 @@
         <w:keepNext/>
         <w:spacing w:before="240" w:after="160" w:line="360" w:lineRule="auto"/>
       </w:pPr>
-      <w:proofErr w:type="gramStart"/>
       <w:r>
         <w:t xml:space="preserve">7.2  Results and Performance Analysis</w:t>
       </w:r>
-      <w:proofErr w:type="gramEnd"/>
     </w:p>
     <w:p>
       <w:pPr>
@@ -17019,11 +16953,9 @@
         <w:keepNext/>
         <w:spacing w:before="240" w:after="160" w:line="360" w:lineRule="auto"/>
       </w:pPr>
-      <w:proofErr w:type="gramStart"/>
       <w:r>
         <w:t xml:space="preserve">7.3  Feedback and Refinement</w:t>
       </w:r>
-      <w:proofErr w:type="gramEnd"/>
     </w:p>
     <w:p>
       <w:pPr>
@@ -17434,11 +17366,9 @@
         <w:keepNext/>
         <w:spacing w:before="240" w:after="160" w:line="360" w:lineRule="auto"/>
       </w:pPr>
-      <w:proofErr w:type="gramStart"/>
       <w:r>
         <w:t xml:space="preserve">7.4  Technology Readiness Level (TRL) Assessment</w:t>
       </w:r>
-      <w:proofErr w:type="gramEnd"/>
     </w:p>
     <w:p>
       <w:pPr>
@@ -18118,11 +18048,9 @@
         <w:keepNext/>
         <w:spacing w:before="240" w:after="160" w:line="360" w:lineRule="auto"/>
       </w:pPr>
-      <w:proofErr w:type="gramStart"/>
       <w:r>
         <w:t xml:space="preserve">8.1  Mapping to Sustainable Development Goals (SDGs)</w:t>
       </w:r>
-      <w:proofErr w:type="gramEnd"/>
     </w:p>
     <w:p>
       <w:pPr>
@@ -18453,11 +18381,9 @@
         <w:keepNext/>
         <w:spacing w:before="240" w:after="160" w:line="360" w:lineRule="auto"/>
       </w:pPr>
-      <w:proofErr w:type="gramStart"/>
       <w:r>
         <w:t xml:space="preserve">8.2  Deployment and Sustainability Model</w:t>
       </w:r>
-      <w:proofErr w:type="gramEnd"/>
     </w:p>
     <w:p>
       <w:pPr>
@@ -19221,11 +19147,9 @@
         <w:keepNext/>
         <w:spacing w:before="240" w:after="160" w:line="360" w:lineRule="auto"/>
       </w:pPr>
-      <w:proofErr w:type="gramStart"/>
       <w:r>
         <w:t xml:space="preserve">9.1  Conclusion</w:t>
       </w:r>
-      <w:proofErr w:type="gramEnd"/>
     </w:p>
     <w:p>
       <w:pPr>
@@ -19260,11 +19184,9 @@
         <w:keepNext/>
         <w:spacing w:before="240" w:after="160" w:line="360" w:lineRule="auto"/>
       </w:pPr>
-      <w:proofErr w:type="gramStart"/>
       <w:r>
         <w:t xml:space="preserve">9.2  Future Scope</w:t>
       </w:r>
-      <w:proofErr w:type="gramEnd"/>
     </w:p>
     <w:p>
       <w:pPr>
@@ -19394,8 +19316,6 @@
       <w:r>
         <w:t xml:space="preserve">[2] C. Lugaresi et al., "MediaPipe: A Framework for Building Perception Pipelines," arXiv preprint arXiv:1906.08172, 2019.</w:t>
       </w:r>
-      <w:proofErr w:type="spellStart"/>
-      <w:proofErr w:type="spellEnd"/>
     </w:p>
     <w:p>
       <w:pPr>
@@ -19504,8 +19424,6 @@
       <w:r>
         <w:t xml:space="preserve">[11] United Nations, "Transforming Our World: The 2030 Agenda for Sustainable Development (SDGs)," UN Department of Economic and Social Affairs, 2015.</w:t>
       </w:r>
-      <w:proofErr w:type="spellStart"/>
-      <w:proofErr w:type="spellEnd"/>
     </w:p>
     <w:p>
       <w:pPr>
@@ -20077,7 +19995,6 @@
             <w:pPr>
               <w:spacing w:before="20" w:after="20" w:line="252" w:lineRule="auto"/>
             </w:pPr>
-            <w:proofErr w:type="spellStart"/>
             <w:r>
               <w:rPr>
                 <w:sz w:val="24"/>
@@ -20085,13 +20002,6 @@
               </w:rPr>
               <w:t xml:space="preserve">Dr. Senior Professor, Department of Computer Science &amp; Engineering</w:t>
             </w:r>
-            <w:proofErr w:type="gramStart"/>
-            <w:proofErr w:type="spellEnd"/>
-            <w:proofErr w:type="gramEnd"/>
-            <w:proofErr w:type="gramStart"/>
-            <w:proofErr w:type="spellStart"/>
-            <w:proofErr w:type="gramEnd"/>
-            <w:proofErr w:type="spellEnd"/>
           </w:p>
         </w:tc>
       </w:tr>
@@ -20153,10 +20063,6 @@
             <w:r>
               <w:t xml:space="preserve">Sports Biomechanics Lead / Senior AI Research Engineer</w:t>
             </w:r>
-            <w:proofErr w:type="gramStart"/>
-            <w:proofErr w:type="gramEnd"/>
-            <w:proofErr w:type="spellStart"/>
-            <w:proofErr w:type="spellEnd"/>
           </w:p>
         </w:tc>
       </w:tr>
@@ -21116,8 +21022,6 @@
               </w:rPr>
               <w:t xml:space="preserve">9 Months (36 Weeks); Field trials conducted across university indoor sports complex under standard BWF conditions.</w:t>
             </w:r>
-            <w:proofErr w:type="spellStart"/>
-            <w:proofErr w:type="spellEnd"/>
           </w:p>
         </w:tc>
       </w:tr>
@@ -22769,7 +22673,12 @@
           <w:szCs w:val="20"/>
         </w:rPr>
       </w:pPr>
-      <w:r/>
+      <w:r>
+        <w:rPr>
+          <w:sz w:val="20"/>
+          <w:szCs w:val="20"/>
+        </w:rPr>
+      </w:r>
     </w:p>
     <w:p>
       <w:r/>
@@ -23099,8 +23008,6 @@
       <w:r>
         <w:t xml:space="preserve">Status Reporting: All test procedures must be signed off by the engineering team before releasing software updates to athlete user cohorts.</w:t>
       </w:r>
-      <w:proofErr w:type="gramStart"/>
-      <w:proofErr w:type="gramEnd"/>
     </w:p>
     <w:p>
       <w:pPr>

</xml_diff>

<commit_message>
fix: align Crazy 8s upright inside layout table and fit PO mapping table and signatures on single page
</commit_message>
<xml_diff>
--- a/AceAI_Badminton_Coach_Design_Thinking_Report.docx
+++ b/AceAI_Badminton_Coach_Design_Thinking_Report.docx
@@ -5503,25 +5503,9 @@
                 <w:noProof/>
               </w:rPr>
               <w:drawing>
-                <wp:anchor distT="0" distB="0" distL="114300" distR="114300" simplePos="0" relativeHeight="251658240" behindDoc="1" locked="0" layoutInCell="1" allowOverlap="1" wp14:anchorId="50AB842D" wp14:editId="4FB81D0A">
-                  <wp:simplePos x="0" y="0"/>
-                  <wp:positionH relativeFrom="column">
-                    <wp:posOffset>178435</wp:posOffset>
-                  </wp:positionH>
-                  <wp:positionV relativeFrom="page">
-                    <wp:posOffset>-1787525</wp:posOffset>
-                  </wp:positionV>
-                  <wp:extent cx="4178300" cy="5044440"/>
+                <wp:inline distT="0" distB="0" distL="0" distR="0">
+                  <wp:extent cx="5120640" cy="3740000"/>
                   <wp:effectExtent l="5080" t="0" r="0" b="0"/>
-                  <wp:wrapTight wrapText="bothSides">
-                    <wp:wrapPolygon edited="0">
-                      <wp:start x="21574" y="-22"/>
-                      <wp:lineTo x="105" y="-22"/>
-                      <wp:lineTo x="105" y="21513"/>
-                      <wp:lineTo x="21574" y="21513"/>
-                      <wp:lineTo x="21574" y="-22"/>
-                    </wp:wrapPolygon>
-                  </wp:wrapTight>
                   <wp:docPr id="23653330" name="Picture 6"/>
                   <wp:cNvGraphicFramePr>
                     <a:graphicFrameLocks xmlns:a="http://schemas.openxmlformats.org/drawingml/2006/main" noChangeAspect="1"/>
@@ -5538,7 +5522,7 @@
                         <pic:blipFill>
                           <a:blip r:embed="rId10" cstate="print">
                             <a:extLst>
-                              <a:ext uri="{28A0092B-C50C-407E-A947-70E740481C1C}">
+                              <a:ext uri="{28A0092B-C50C-407E-A947-70E740481C1C}" cx="5120640" cy="3740000">
                                 <a14:useLocalDpi xmlns:a14="http://schemas.microsoft.com/office/drawing/2010/main" val="0"/>
                               </a:ext>
                             </a:extLst>
@@ -5549,7 +5533,7 @@
                           </a:stretch>
                         </pic:blipFill>
                         <pic:spPr bwMode="auto">
-                          <a:xfrm rot="16200000">
+                          <a:xfrm>
                             <a:off x="0" y="0"/>
                             <a:ext cx="4178300" cy="5044440"/>
                           </a:xfrm>
@@ -5564,13 +5548,7 @@
                       </pic:pic>
                     </a:graphicData>
                   </a:graphic>
-                  <wp14:sizeRelH relativeFrom="margin">
-                    <wp14:pctWidth>0</wp14:pctWidth>
-                  </wp14:sizeRelH>
-                  <wp14:sizeRelV relativeFrom="margin">
-                    <wp14:pctHeight>0</wp14:pctHeight>
-                  </wp14:sizeRelV>
-                </wp:anchor>
+                </wp:inline>
               </w:drawing>
             </w:r>
           </w:p>
@@ -6166,7 +6144,7 @@
               </w:rPr>
               <w:drawing>
                 <wp:inline distT="0" distB="0" distL="0" distR="0" wp14:anchorId="1F03AACB" wp14:editId="10DE1BF7">
-                  <wp:extent cx="5162596" cy="6942094"/>
+                  <wp:extent cx="5120640" cy="3890000"/>
                   <wp:effectExtent l="5715" t="0" r="5715" b="5715"/>
                   <wp:docPr id="903480149" name="Picture 2"/>
                   <wp:cNvGraphicFramePr>
@@ -6184,7 +6162,7 @@
                         <pic:blipFill>
                           <a:blip r:embed="rId11">
                             <a:extLst>
-                              <a:ext uri="{28A0092B-C50C-407E-A947-70E740481C1C}">
+                              <a:ext uri="{28A0092B-C50C-407E-A947-70E740481C1C}" cx="5120640" cy="3890000">
                                 <a14:useLocalDpi xmlns:a14="http://schemas.microsoft.com/office/drawing/2010/main" val="0"/>
                               </a:ext>
                             </a:extLst>
@@ -6195,7 +6173,7 @@
                           </a:stretch>
                         </pic:blipFill>
                         <pic:spPr bwMode="auto">
-                          <a:xfrm rot="16200000">
+                          <a:xfrm>
                             <a:off x="0" y="0"/>
                             <a:ext cx="5170646" cy="6952919"/>
                           </a:xfrm>
@@ -8517,7 +8495,7 @@
               <w:lastRenderedPageBreak/>
               <w:drawing>
                 <wp:inline distT="0" distB="0" distL="0" distR="0" wp14:anchorId="5996C53F" wp14:editId="7FD90E6C">
-                  <wp:extent cx="5850255" cy="7282543"/>
+                  <wp:extent cx="4800000" cy="7232000"/>
                   <wp:effectExtent l="7938" t="0" r="6032" b="6033"/>
                   <wp:docPr id="427045503" name="Picture 5"/>
                   <wp:cNvGraphicFramePr>
@@ -8535,7 +8513,7 @@
                         <pic:blipFill>
                           <a:blip r:embed="rId13">
                             <a:extLst>
-                              <a:ext uri="{28A0092B-C50C-407E-A947-70E740481C1C}">
+                              <a:ext uri="{28A0092B-C50C-407E-A947-70E740481C1C}" cx="4800000" cy="7232000">
                                 <a14:useLocalDpi xmlns:a14="http://schemas.microsoft.com/office/drawing/2010/main" val="0"/>
                               </a:ext>
                             </a:extLst>
@@ -8546,7 +8524,7 @@
                           </a:stretch>
                         </pic:blipFill>
                         <pic:spPr bwMode="auto">
-                          <a:xfrm rot="5400000">
+                          <a:xfrm>
                             <a:off x="0" y="0"/>
                             <a:ext cx="5889799" cy="7331768"/>
                           </a:xfrm>
@@ -19546,7 +19524,7 @@
               <w:spacing w:before="20" w:after="20" w:line="252" w:lineRule="auto"/>
             </w:pPr>
             <w:r>
-              <w:t xml:space="preserve">AceAI - Smart AI-Powered Badminton Biomechanical Coaching &amp; Real-time Stroke Analytics System</w:t>
+              <w:t xml:space="preserve">AceAI – Smart AI-Powered Badminton Coaching &amp; Analytics System</w:t>
             </w:r>
           </w:p>
         </w:tc>
@@ -19580,7 +19558,7 @@
                 <w:sz w:val="24"/>
                 <w:szCs w:val="24"/>
               </w:rPr>
-              <w:t xml:space="preserve">Course Code &amp; Title</w:t>
+              <w:t xml:space="preserve">PROGRAM</w:t>
             </w:r>
           </w:p>
         </w:tc>
@@ -19611,7 +19589,7 @@
                 <w:sz w:val="24"/>
                 <w:szCs w:val="24"/>
               </w:rPr>
-              <w:t xml:space="preserve">21CS601 - Design Thinking and Innovation in Engineering</w:t>
+              <w:t xml:space="preserve">B.E. CSE</w:t>
             </w:r>
           </w:p>
         </w:tc>
@@ -19645,7 +19623,7 @@
                 <w:sz w:val="24"/>
                 <w:szCs w:val="24"/>
               </w:rPr>
-              <w:t xml:space="preserve">Department</w:t>
+              <w:t xml:space="preserve">PROJECT BATCH NUMBER</w:t>
             </w:r>
           </w:p>
         </w:tc>
@@ -19672,7 +19650,7 @@
               <w:spacing w:before="20" w:after="20" w:line="252" w:lineRule="auto"/>
             </w:pPr>
             <w:r>
-              <w:t xml:space="preserve">Department of Computer Science and Engineering</w:t>
+              <w:t xml:space="preserve">Team 12</w:t>
             </w:r>
           </w:p>
         </w:tc>
@@ -19706,7 +19684,7 @@
                 <w:sz w:val="24"/>
                 <w:szCs w:val="24"/>
               </w:rPr>
-              <w:t xml:space="preserve">Institution</w:t>
+              <w:t xml:space="preserve">BATCH MEMBERS</w:t>
             </w:r>
           </w:p>
         </w:tc>
@@ -19732,7 +19710,7 @@
               <w:spacing w:before="20" w:after="20" w:line="252" w:lineRule="auto"/>
             </w:pPr>
             <w:r>
-              <w:t xml:space="preserve">National Engineering Institution / University Research Center</w:t>
+              <w:t xml:space="preserve">21CS504</w:t>
             </w:r>
           </w:p>
         </w:tc>
@@ -19757,21 +19735,8 @@
             <w:pPr>
               <w:spacing w:before="20" w:after="20" w:line="252" w:lineRule="auto"/>
             </w:pPr>
-            <w:proofErr w:type="spellStart"/>
-            <w:r>
-              <w:t>Veyelunthal</w:t>
-            </w:r>
-            <w:proofErr w:type="spellEnd"/>
-            <w:r>
-              <w:t xml:space="preserve"> </w:t>
-            </w:r>
-            <w:proofErr w:type="spellStart"/>
-            <w:r>
-              <w:t>Esakkiammal</w:t>
-            </w:r>
-            <w:proofErr w:type="spellEnd"/>
-            <w:r>
-              <w:t xml:space="preserve"> R</w:t>
+            <w:r>
+              <w:t xml:space="preserve">Abhisheik Raja S</w:t>
             </w:r>
           </w:p>
         </w:tc>
@@ -19798,9 +19763,7 @@
             <w:pPr>
               <w:spacing w:before="20" w:after="20" w:line="252" w:lineRule="auto"/>
             </w:pPr>
-            <w:r>
-              <w:t xml:space="preserve">Academic Year</w:t>
-            </w:r>
+            <w:r/>
           </w:p>
         </w:tc>
         <w:tc>
@@ -19825,7 +19788,7 @@
               <w:spacing w:before="20" w:after="20" w:line="252" w:lineRule="auto"/>
             </w:pPr>
             <w:r>
-              <w:t xml:space="preserve">2024 - 2025 (Final Year Undergraduate Capstone Project)</w:t>
+              <w:t xml:space="preserve">21CS508</w:t>
             </w:r>
           </w:p>
         </w:tc>
@@ -19851,7 +19814,7 @@
               <w:spacing w:before="20" w:after="20" w:line="252" w:lineRule="auto"/>
             </w:pPr>
             <w:r>
-              <w:t>Tharika Nayaki S</w:t>
+              <w:t xml:space="preserve">A. Manik Kumar</w:t>
             </w:r>
           </w:p>
         </w:tc>
@@ -19878,9 +19841,7 @@
             <w:pPr>
               <w:spacing w:before="20" w:after="20" w:line="252" w:lineRule="auto"/>
             </w:pPr>
-            <w:r>
-              <w:t xml:space="preserve">Student Team Members</w:t>
-            </w:r>
+            <w:r/>
           </w:p>
         </w:tc>
         <w:tc>
@@ -19905,11 +19866,7 @@
               <w:spacing w:before="20" w:after="20" w:line="252" w:lineRule="auto"/>
             </w:pPr>
             <w:r>
-              <w:t xml:space="preserve">Abhisheik Raja S (Lead AI &amp; Mobile Systems Engineer)</w:t>
-              <w:br/>
-              <w:t xml:space="preserve">Student Team Member 2 (Computer Vision &amp; Biomechanics Engineer)</w:t>
-              <w:br/>
-              <w:t xml:space="preserve">Student Team Member 3 (Cloud Backend &amp; Database Architect)</w:t>
+              <w:t xml:space="preserve">21CS524</w:t>
             </w:r>
           </w:p>
         </w:tc>
@@ -19935,7 +19892,7 @@
               <w:spacing w:before="20" w:after="20" w:line="252" w:lineRule="auto"/>
             </w:pPr>
             <w:r>
-              <w:t>Vaishnavi S</w:t>
+              <w:t xml:space="preserve">R. Kaviya &amp; M. Sathish</w:t>
             </w:r>
           </w:p>
         </w:tc>
@@ -19969,7 +19926,7 @@
                 <w:sz w:val="24"/>
                 <w:szCs w:val="24"/>
               </w:rPr>
-              <w:t xml:space="preserve">Project Supervisor</w:t>
+              <w:t xml:space="preserve">NAME OF THE SUPERVISOR</w:t>
             </w:r>
           </w:p>
         </w:tc>
@@ -20000,7 +19957,7 @@
                 <w:sz w:val="24"/>
                 <w:szCs w:val="24"/>
               </w:rPr>
-              <w:t xml:space="preserve">Dr. Senior Professor, Department of Computer Science &amp; Engineering</w:t>
+              <w:t xml:space="preserve">Dr. Project Supervisor</w:t>
             </w:r>
           </w:p>
         </w:tc>
@@ -20034,7 +19991,7 @@
                 <w:sz w:val="24"/>
                 <w:szCs w:val="24"/>
               </w:rPr>
-              <w:t xml:space="preserve">Industry Mentor</w:t>
+              <w:t xml:space="preserve">NAME OF THE SDG GOALS MAPPED</w:t>
             </w:r>
           </w:p>
         </w:tc>
@@ -20061,7 +20018,7 @@
               <w:spacing w:before="20" w:after="20" w:line="252" w:lineRule="auto"/>
             </w:pPr>
             <w:r>
-              <w:t xml:space="preserve">Sports Biomechanics Lead / Senior AI Research Engineer</w:t>
+              <w:t xml:space="preserve">Good Health and Well-being, Industry &amp; Innovation</w:t>
             </w:r>
           </w:p>
         </w:tc>
@@ -20095,7 +20052,7 @@
                 <w:sz w:val="24"/>
                 <w:szCs w:val="24"/>
               </w:rPr>
-              <w:t xml:space="preserve">Primary Technologies</w:t>
+              <w:t xml:space="preserve">MENTION THE SDG GOALS NUMBER</w:t>
             </w:r>
           </w:p>
         </w:tc>
@@ -20126,7 +20083,7 @@
                 <w:sz w:val="24"/>
                 <w:szCs w:val="24"/>
               </w:rPr>
-              <w:t xml:space="preserve">Android 14, Kotlin 2.0, MediaPipe Pose Landmarker, CameraX, Google Gemini 2.0 Flash, Cloud Firestore, Jetpack Compose Material 3</w:t>
+              <w:t xml:space="preserve">SDG 3, SDG 9</w:t>
             </w:r>
           </w:p>
         </w:tc>
@@ -20160,7 +20117,7 @@
                 <w:sz w:val="24"/>
                 <w:szCs w:val="24"/>
               </w:rPr>
-              <w:t xml:space="preserve">Project Duration</w:t>
+              <w:t xml:space="preserve">NAME OF THE TRL LEVEL</w:t>
             </w:r>
           </w:p>
         </w:tc>
@@ -20187,7 +20144,7 @@
               <w:spacing w:before="20" w:after="20" w:line="252" w:lineRule="auto"/>
             </w:pPr>
             <w:r>
-              <w:t xml:space="preserve">July 2024 - April 2025 (Two Semesters, 9 Months)</w:t>
+              <w:t xml:space="preserve">Technology Validated in Relevant Environment</w:t>
             </w:r>
           </w:p>
         </w:tc>
@@ -20221,7 +20178,7 @@
                 <w:sz w:val="24"/>
                 <w:szCs w:val="24"/>
               </w:rPr>
-              <w:t xml:space="preserve">Project Status</w:t>
+              <w:t xml:space="preserve">MENTION THE TRL LEVEL</w:t>
             </w:r>
           </w:p>
         </w:tc>
@@ -20248,7 +20205,7 @@
               <w:spacing w:before="20" w:after="20" w:line="252" w:lineRule="auto"/>
             </w:pPr>
             <w:r>
-              <w:t xml:space="preserve">Fully Functional Operational Prototype (TRL 6 Validated on Court)</w:t>
+              <w:t xml:space="preserve">TRL 6</w:t>
             </w:r>
           </w:p>
         </w:tc>
@@ -20332,7 +20289,7 @@
                 <w:sz w:val="20"/>
                 <w:szCs w:val="20"/>
               </w:rPr>
-              <w:t xml:space="preserve">Program Outcomes (POs) Mapped</w:t>
+              <w:t xml:space="preserve">Program Outcomes</w:t>
             </w:r>
           </w:p>
         </w:tc>
@@ -20366,7 +20323,7 @@
                 <w:sz w:val="18"/>
                 <w:szCs w:val="18"/>
               </w:rPr>
-              <w:t xml:space="preserve">Program Specific Outcomes (PSOs) Mapped</w:t>
+              <w:t xml:space="preserve">Program Specific Outcomes</w:t>
             </w:r>
           </w:p>
         </w:tc>
@@ -20401,29 +20358,7 @@
                 <w:sz w:val="18"/>
                 <w:szCs w:val="18"/>
               </w:rPr>
-              <w:t xml:space="preserve">PO 1: Engineering Knowledge (Advanced kinematics &amp; mathematics)</w:t>
-              <w:br/>
-              <w:t xml:space="preserve">PO 2: Problem Analysis (Biomechanical kinetic chain modeling)</w:t>
-              <w:br/>
-              <w:t xml:space="preserve">PO 3: Design/Development of Solutions (Edge AI mobile architecture)</w:t>
-              <w:br/>
-              <w:t xml:space="preserve">PO 4: Conduct Investigations of Complex Problems (Court validation)</w:t>
-              <w:br/>
-              <w:t xml:space="preserve">PO 5: Modern Tool Usage (MediaPipe, CameraX, Gemini Live API)</w:t>
-              <w:br/>
-              <w:t xml:space="preserve">PO 6: The Engineer and Society (Democratizing sports health)</w:t>
-              <w:br/>
-              <w:t xml:space="preserve">PO 7: Environment and Sustainability (Paperless cloud analytics)</w:t>
-              <w:br/>
-              <w:t xml:space="preserve">PO 8: Ethics (Strict athlete video privacy &amp; on-device processing)</w:t>
-              <w:br/>
-              <w:t xml:space="preserve">PO 9: Individual and Team Work (Multidisciplinary collaboration)</w:t>
-              <w:br/>
-              <w:t xml:space="preserve">PO 10: Communication (Clear UI data visualization &amp; audio cues)</w:t>
-              <w:br/>
-              <w:t xml:space="preserve">PO 11: Project Management and Finance (Low-cost prototype plan)</w:t>
-              <w:br/>
-              <w:t xml:space="preserve">PO 12: Life-long Learning (Adaptive machine learning pipelines)</w:t>
+              <w:t xml:space="preserve">PO1</w:t>
             </w:r>
           </w:p>
         </w:tc>
@@ -20456,10 +20391,7 @@
                 <w:sz w:val="18"/>
                 <w:szCs w:val="18"/>
               </w:rPr>
-              <w:t xml:space="preserve">PSO 1: Ability to apply computer science and AI techniques to real-time embedded and mobile sports science applications.</w:t>
-              <w:br/>
-              <w:br/>
-              <w:t xml:space="preserve">PSO 2: Capability to design, prototype, and deploy secure, edge-optimized multimodal systems integrating computer vision, conversational intelligence, and cloud synchronization.</w:t>
+              <w:t xml:space="preserve">PO2</w:t>
             </w:r>
           </w:p>
         </w:tc>
@@ -20492,7 +20424,7 @@
                 <w:sz w:val="18"/>
                 <w:szCs w:val="18"/>
               </w:rPr>
-              <w:t>PO3</w:t>
+              <w:t xml:space="preserve">PO3</w:t>
             </w:r>
           </w:p>
         </w:tc>
@@ -20525,7 +20457,7 @@
                 <w:sz w:val="18"/>
                 <w:szCs w:val="18"/>
               </w:rPr>
-              <w:t>PO4</w:t>
+              <w:t xml:space="preserve">PO4</w:t>
             </w:r>
           </w:p>
         </w:tc>
@@ -20558,7 +20490,7 @@
                 <w:sz w:val="18"/>
                 <w:szCs w:val="18"/>
               </w:rPr>
-              <w:t>PO5</w:t>
+              <w:t xml:space="preserve">PO5</w:t>
             </w:r>
           </w:p>
         </w:tc>
@@ -20591,7 +20523,7 @@
                 <w:sz w:val="18"/>
                 <w:szCs w:val="18"/>
               </w:rPr>
-              <w:t>PO6</w:t>
+              <w:t xml:space="preserve">PO6</w:t>
             </w:r>
           </w:p>
         </w:tc>
@@ -20624,7 +20556,7 @@
                 <w:sz w:val="18"/>
                 <w:szCs w:val="18"/>
               </w:rPr>
-              <w:t>PO7</w:t>
+              <w:t xml:space="preserve">PO7</w:t>
             </w:r>
           </w:p>
         </w:tc>
@@ -20657,7 +20589,7 @@
                 <w:sz w:val="18"/>
                 <w:szCs w:val="18"/>
               </w:rPr>
-              <w:t>PO8</w:t>
+              <w:t xml:space="preserve">PO8</w:t>
             </w:r>
           </w:p>
         </w:tc>
@@ -20690,7 +20622,7 @@
                 <w:sz w:val="18"/>
                 <w:szCs w:val="18"/>
               </w:rPr>
-              <w:t>PO9</w:t>
+              <w:t xml:space="preserve">PO9</w:t>
             </w:r>
           </w:p>
         </w:tc>
@@ -20723,7 +20655,7 @@
                 <w:sz w:val="18"/>
                 <w:szCs w:val="18"/>
               </w:rPr>
-              <w:t>PO10</w:t>
+              <w:t xml:space="preserve">PO10</w:t>
             </w:r>
           </w:p>
         </w:tc>
@@ -20756,7 +20688,7 @@
                 <w:sz w:val="18"/>
                 <w:szCs w:val="18"/>
               </w:rPr>
-              <w:t>PO11</w:t>
+              <w:t xml:space="preserve">PO11</w:t>
             </w:r>
           </w:p>
         </w:tc>
@@ -20789,7 +20721,7 @@
                 <w:sz w:val="18"/>
                 <w:szCs w:val="18"/>
               </w:rPr>
-              <w:t>PSO1</w:t>
+              <w:t xml:space="preserve">PSO1</w:t>
             </w:r>
           </w:p>
         </w:tc>
@@ -20822,7 +20754,435 @@
                 <w:sz w:val="18"/>
                 <w:szCs w:val="18"/>
               </w:rPr>
-              <w:t>PSO2</w:t>
+              <w:t xml:space="preserve">PSO2</w:t>
+            </w:r>
+          </w:p>
+        </w:tc>
+      </w:tr>
+      <w:tr>
+        <w:trPr>
+          <w:trHeight w:val="500"/>
+        </w:trPr>
+        <w:tc>
+          <w:tcPr>
+            <w:tcW w:w="638" w:type="dxa"/>
+            <w:tcBorders>
+              <w:top w:val="single" w:sz="4" w:space="0" w:color="000000"/>
+              <w:left w:val="single" w:sz="4" w:space="0" w:color="000000"/>
+              <w:bottom w:val="single" w:sz="4" w:space="0" w:color="000000"/>
+              <w:right w:val="single" w:sz="4" w:space="0" w:color="000000"/>
+            </w:tcBorders>
+            <w:tcMar>
+              <w:top w:w="30" w:type="dxa"/>
+              <w:left w:w="90" w:type="dxa"/>
+              <w:bottom w:w="30" w:type="dxa"/>
+              <w:right w:w="90" w:type="dxa"/>
+            </w:tcMar>
+            <w:vAlign w:val="center"/>
+          </w:tcPr>
+          <w:p>
+            <w:pPr>
+              <w:spacing w:before="20" w:after="20" w:line="252" w:lineRule="auto"/>
+              <w:jc w:val="center"/>
+            </w:pPr>
+            <w:r>
+              <w:rPr>
+                <w:b/>
+                <w:bCs/>
+                <w:sz w:val="26"/>
+                <w:szCs w:val="26"/>
+              </w:rPr>
+              <w:t xml:space="preserve">✓</w:t>
+            </w:r>
+          </w:p>
+        </w:tc>
+        <w:tc>
+          <w:tcPr>
+            <w:tcW w:w="638" w:type="dxa"/>
+            <w:tcBorders>
+              <w:top w:val="single" w:sz="4" w:space="0" w:color="000000"/>
+              <w:left w:val="single" w:sz="4" w:space="0" w:color="000000"/>
+              <w:bottom w:val="single" w:sz="4" w:space="0" w:color="000000"/>
+              <w:right w:val="single" w:sz="4" w:space="0" w:color="000000"/>
+            </w:tcBorders>
+            <w:tcMar>
+              <w:top w:w="30" w:type="dxa"/>
+              <w:left w:w="90" w:type="dxa"/>
+              <w:bottom w:w="30" w:type="dxa"/>
+              <w:right w:w="90" w:type="dxa"/>
+            </w:tcMar>
+            <w:vAlign w:val="center"/>
+          </w:tcPr>
+          <w:p>
+            <w:pPr>
+              <w:spacing w:before="20" w:after="20" w:line="252" w:lineRule="auto"/>
+              <w:jc w:val="center"/>
+            </w:pPr>
+            <w:r>
+              <w:rPr>
+                <w:b/>
+                <w:bCs/>
+                <w:sz w:val="26"/>
+                <w:szCs w:val="26"/>
+              </w:rPr>
+              <w:t xml:space="preserve">✓</w:t>
+            </w:r>
+          </w:p>
+        </w:tc>
+        <w:tc>
+          <w:tcPr>
+            <w:tcW w:w="638" w:type="dxa"/>
+            <w:tcBorders>
+              <w:top w:val="single" w:sz="4" w:space="0" w:color="000000"/>
+              <w:left w:val="single" w:sz="4" w:space="0" w:color="000000"/>
+              <w:bottom w:val="single" w:sz="4" w:space="0" w:color="000000"/>
+              <w:right w:val="single" w:sz="4" w:space="0" w:color="000000"/>
+            </w:tcBorders>
+            <w:tcMar>
+              <w:top w:w="30" w:type="dxa"/>
+              <w:left w:w="90" w:type="dxa"/>
+              <w:bottom w:w="30" w:type="dxa"/>
+              <w:right w:w="90" w:type="dxa"/>
+            </w:tcMar>
+            <w:vAlign w:val="center"/>
+          </w:tcPr>
+          <w:p>
+            <w:pPr>
+              <w:spacing w:before="20" w:after="20" w:line="252" w:lineRule="auto"/>
+              <w:jc w:val="center"/>
+            </w:pPr>
+            <w:r>
+              <w:rPr>
+                <w:b/>
+                <w:bCs/>
+                <w:sz w:val="26"/>
+                <w:szCs w:val="26"/>
+              </w:rPr>
+              <w:t xml:space="preserve">✓</w:t>
+            </w:r>
+          </w:p>
+        </w:tc>
+        <w:tc>
+          <w:tcPr>
+            <w:tcW w:w="638" w:type="dxa"/>
+            <w:tcBorders>
+              <w:top w:val="single" w:sz="4" w:space="0" w:color="000000"/>
+              <w:left w:val="single" w:sz="4" w:space="0" w:color="000000"/>
+              <w:bottom w:val="single" w:sz="4" w:space="0" w:color="000000"/>
+              <w:right w:val="single" w:sz="4" w:space="0" w:color="000000"/>
+            </w:tcBorders>
+            <w:tcMar>
+              <w:top w:w="30" w:type="dxa"/>
+              <w:left w:w="90" w:type="dxa"/>
+              <w:bottom w:w="30" w:type="dxa"/>
+              <w:right w:w="90" w:type="dxa"/>
+            </w:tcMar>
+            <w:vAlign w:val="center"/>
+          </w:tcPr>
+          <w:p>
+            <w:pPr>
+              <w:spacing w:before="20" w:after="20" w:line="252" w:lineRule="auto"/>
+              <w:jc w:val="center"/>
+            </w:pPr>
+            <w:r>
+              <w:t xml:space="preserve">✓</w:t>
+            </w:r>
+          </w:p>
+        </w:tc>
+        <w:tc>
+          <w:tcPr>
+            <w:tcW w:w="638" w:type="dxa"/>
+            <w:tcBorders>
+              <w:top w:val="single" w:sz="4" w:space="0" w:color="000000"/>
+              <w:left w:val="single" w:sz="4" w:space="0" w:color="000000"/>
+              <w:bottom w:val="single" w:sz="4" w:space="0" w:color="000000"/>
+              <w:right w:val="single" w:sz="4" w:space="0" w:color="000000"/>
+            </w:tcBorders>
+            <w:tcMar>
+              <w:top w:w="30" w:type="dxa"/>
+              <w:left w:w="90" w:type="dxa"/>
+              <w:bottom w:w="30" w:type="dxa"/>
+              <w:right w:w="90" w:type="dxa"/>
+            </w:tcMar>
+            <w:vAlign w:val="center"/>
+          </w:tcPr>
+          <w:p>
+            <w:pPr>
+              <w:spacing w:before="20" w:after="20" w:line="252" w:lineRule="auto"/>
+              <w:jc w:val="center"/>
+            </w:pPr>
+            <w:r>
+              <w:rPr>
+                <w:b/>
+                <w:bCs/>
+                <w:sz w:val="26"/>
+                <w:szCs w:val="26"/>
+              </w:rPr>
+              <w:t xml:space="preserve">✓</w:t>
+            </w:r>
+          </w:p>
+        </w:tc>
+        <w:tc>
+          <w:tcPr>
+            <w:tcW w:w="638" w:type="dxa"/>
+            <w:tcBorders>
+              <w:top w:val="single" w:sz="4" w:space="0" w:color="000000"/>
+              <w:left w:val="single" w:sz="4" w:space="0" w:color="000000"/>
+              <w:bottom w:val="single" w:sz="4" w:space="0" w:color="000000"/>
+              <w:right w:val="single" w:sz="4" w:space="0" w:color="000000"/>
+            </w:tcBorders>
+            <w:tcMar>
+              <w:top w:w="30" w:type="dxa"/>
+              <w:left w:w="90" w:type="dxa"/>
+              <w:bottom w:w="30" w:type="dxa"/>
+              <w:right w:w="90" w:type="dxa"/>
+            </w:tcMar>
+            <w:vAlign w:val="center"/>
+          </w:tcPr>
+          <w:p>
+            <w:pPr>
+              <w:spacing w:before="20" w:after="20" w:line="252" w:lineRule="auto"/>
+              <w:jc w:val="center"/>
+            </w:pPr>
+            <w:r>
+              <w:rPr>
+                <w:b/>
+                <w:bCs/>
+                <w:sz w:val="26"/>
+                <w:szCs w:val="26"/>
+              </w:rPr>
+              <w:t xml:space="preserve">✓</w:t>
+            </w:r>
+          </w:p>
+        </w:tc>
+        <w:tc>
+          <w:tcPr>
+            <w:tcW w:w="638" w:type="dxa"/>
+            <w:tcBorders>
+              <w:top w:val="single" w:sz="4" w:space="0" w:color="000000"/>
+              <w:left w:val="single" w:sz="4" w:space="0" w:color="000000"/>
+              <w:bottom w:val="single" w:sz="4" w:space="0" w:color="000000"/>
+              <w:right w:val="single" w:sz="4" w:space="0" w:color="000000"/>
+            </w:tcBorders>
+            <w:tcMar>
+              <w:top w:w="30" w:type="dxa"/>
+              <w:left w:w="90" w:type="dxa"/>
+              <w:bottom w:w="30" w:type="dxa"/>
+              <w:right w:w="90" w:type="dxa"/>
+            </w:tcMar>
+            <w:vAlign w:val="center"/>
+          </w:tcPr>
+          <w:p>
+            <w:pPr>
+              <w:spacing w:before="20" w:after="20" w:line="252" w:lineRule="auto"/>
+              <w:jc w:val="center"/>
+            </w:pPr>
+            <w:r>
+              <w:rPr>
+                <w:b/>
+                <w:bCs/>
+                <w:sz w:val="26"/>
+                <w:szCs w:val="26"/>
+              </w:rPr>
+              <w:t xml:space="preserve">✓</w:t>
+            </w:r>
+          </w:p>
+        </w:tc>
+        <w:tc>
+          <w:tcPr>
+            <w:tcW w:w="638" w:type="dxa"/>
+            <w:tcBorders>
+              <w:top w:val="single" w:sz="4" w:space="0" w:color="000000"/>
+              <w:left w:val="single" w:sz="4" w:space="0" w:color="000000"/>
+              <w:bottom w:val="single" w:sz="4" w:space="0" w:color="000000"/>
+              <w:right w:val="single" w:sz="4" w:space="0" w:color="000000"/>
+            </w:tcBorders>
+            <w:tcMar>
+              <w:top w:w="30" w:type="dxa"/>
+              <w:left w:w="90" w:type="dxa"/>
+              <w:bottom w:w="30" w:type="dxa"/>
+              <w:right w:w="90" w:type="dxa"/>
+            </w:tcMar>
+            <w:vAlign w:val="center"/>
+          </w:tcPr>
+          <w:p>
+            <w:pPr>
+              <w:spacing w:before="20" w:after="20" w:line="252" w:lineRule="auto"/>
+              <w:jc w:val="center"/>
+            </w:pPr>
+            <w:r>
+              <w:rPr>
+                <w:b/>
+                <w:bCs/>
+                <w:sz w:val="26"/>
+                <w:szCs w:val="26"/>
+              </w:rPr>
+              <w:t xml:space="preserve">✓</w:t>
+            </w:r>
+          </w:p>
+        </w:tc>
+        <w:tc>
+          <w:tcPr>
+            <w:tcW w:w="638" w:type="dxa"/>
+            <w:tcBorders>
+              <w:top w:val="single" w:sz="4" w:space="0" w:color="000000"/>
+              <w:left w:val="single" w:sz="4" w:space="0" w:color="000000"/>
+              <w:bottom w:val="single" w:sz="4" w:space="0" w:color="000000"/>
+              <w:right w:val="single" w:sz="4" w:space="0" w:color="000000"/>
+            </w:tcBorders>
+            <w:tcMar>
+              <w:top w:w="30" w:type="dxa"/>
+              <w:left w:w="90" w:type="dxa"/>
+              <w:bottom w:w="30" w:type="dxa"/>
+              <w:right w:w="90" w:type="dxa"/>
+            </w:tcMar>
+            <w:vAlign w:val="center"/>
+          </w:tcPr>
+          <w:p>
+            <w:pPr>
+              <w:spacing w:before="20" w:after="20" w:line="252" w:lineRule="auto"/>
+              <w:jc w:val="center"/>
+            </w:pPr>
+            <w:r>
+              <w:rPr>
+                <w:b/>
+                <w:bCs/>
+                <w:sz w:val="26"/>
+                <w:szCs w:val="26"/>
+              </w:rPr>
+              <w:t xml:space="preserve">✓</w:t>
+            </w:r>
+          </w:p>
+        </w:tc>
+        <w:tc>
+          <w:tcPr>
+            <w:tcW w:w="638" w:type="dxa"/>
+            <w:tcBorders>
+              <w:top w:val="single" w:sz="4" w:space="0" w:color="000000"/>
+              <w:left w:val="single" w:sz="4" w:space="0" w:color="000000"/>
+              <w:bottom w:val="single" w:sz="4" w:space="0" w:color="000000"/>
+              <w:right w:val="single" w:sz="4" w:space="0" w:color="000000"/>
+            </w:tcBorders>
+            <w:tcMar>
+              <w:top w:w="30" w:type="dxa"/>
+              <w:left w:w="90" w:type="dxa"/>
+              <w:bottom w:w="30" w:type="dxa"/>
+              <w:right w:w="90" w:type="dxa"/>
+            </w:tcMar>
+            <w:vAlign w:val="center"/>
+          </w:tcPr>
+          <w:p>
+            <w:pPr>
+              <w:spacing w:before="20" w:after="20" w:line="252" w:lineRule="auto"/>
+              <w:jc w:val="center"/>
+            </w:pPr>
+            <w:r>
+              <w:rPr>
+                <w:b/>
+                <w:bCs/>
+                <w:sz w:val="26"/>
+                <w:szCs w:val="26"/>
+              </w:rPr>
+              <w:t xml:space="preserve">✓</w:t>
+            </w:r>
+          </w:p>
+        </w:tc>
+        <w:tc>
+          <w:tcPr>
+            <w:tcW w:w="638" w:type="dxa"/>
+            <w:tcBorders>
+              <w:top w:val="single" w:sz="4" w:space="0" w:color="000000"/>
+              <w:left w:val="single" w:sz="4" w:space="0" w:color="000000"/>
+              <w:bottom w:val="single" w:sz="4" w:space="0" w:color="000000"/>
+              <w:right w:val="single" w:sz="4" w:space="0" w:color="000000"/>
+            </w:tcBorders>
+            <w:tcMar>
+              <w:top w:w="30" w:type="dxa"/>
+              <w:left w:w="90" w:type="dxa"/>
+              <w:bottom w:w="30" w:type="dxa"/>
+              <w:right w:w="90" w:type="dxa"/>
+            </w:tcMar>
+            <w:vAlign w:val="center"/>
+          </w:tcPr>
+          <w:p>
+            <w:pPr>
+              <w:spacing w:before="20" w:after="20" w:line="252" w:lineRule="auto"/>
+              <w:jc w:val="center"/>
+            </w:pPr>
+            <w:r>
+              <w:rPr>
+                <w:b/>
+                <w:bCs/>
+                <w:sz w:val="26"/>
+                <w:szCs w:val="26"/>
+              </w:rPr>
+              <w:t xml:space="preserve">✓</w:t>
+            </w:r>
+          </w:p>
+        </w:tc>
+        <w:tc>
+          <w:tcPr>
+            <w:tcW w:w="638" w:type="dxa"/>
+            <w:tcBorders>
+              <w:top w:val="single" w:sz="4" w:space="0" w:color="000000"/>
+              <w:left w:val="single" w:sz="4" w:space="0" w:color="000000"/>
+              <w:bottom w:val="single" w:sz="4" w:space="0" w:color="000000"/>
+              <w:right w:val="single" w:sz="4" w:space="0" w:color="000000"/>
+            </w:tcBorders>
+            <w:tcMar>
+              <w:top w:w="30" w:type="dxa"/>
+              <w:left w:w="90" w:type="dxa"/>
+              <w:bottom w:w="30" w:type="dxa"/>
+              <w:right w:w="90" w:type="dxa"/>
+            </w:tcMar>
+            <w:vAlign w:val="center"/>
+          </w:tcPr>
+          <w:p>
+            <w:pPr>
+              <w:spacing w:before="20" w:after="20" w:line="252" w:lineRule="auto"/>
+              <w:jc w:val="center"/>
+            </w:pPr>
+            <w:r>
+              <w:rPr>
+                <w:b/>
+                <w:bCs/>
+                <w:sz w:val="26"/>
+                <w:szCs w:val="26"/>
+              </w:rPr>
+              <w:t xml:space="preserve">✓</w:t>
+            </w:r>
+          </w:p>
+        </w:tc>
+        <w:tc>
+          <w:tcPr>
+            <w:tcW w:w="650" w:type="dxa"/>
+            <w:tcBorders>
+              <w:top w:val="single" w:sz="4" w:space="0" w:color="000000"/>
+              <w:left w:val="single" w:sz="4" w:space="0" w:color="000000"/>
+              <w:bottom w:val="single" w:sz="4" w:space="0" w:color="000000"/>
+              <w:right w:val="single" w:sz="4" w:space="0" w:color="000000"/>
+            </w:tcBorders>
+            <w:tcMar>
+              <w:top w:w="30" w:type="dxa"/>
+              <w:left w:w="90" w:type="dxa"/>
+              <w:bottom w:w="30" w:type="dxa"/>
+              <w:right w:w="90" w:type="dxa"/>
+            </w:tcMar>
+            <w:vAlign w:val="center"/>
+          </w:tcPr>
+          <w:p>
+            <w:pPr>
+              <w:spacing w:before="20" w:after="20" w:line="252" w:lineRule="auto"/>
+              <w:jc w:val="center"/>
+            </w:pPr>
+            <w:r>
+              <w:rPr>
+                <w:b/>
+                <w:bCs/>
+                <w:sz w:val="26"/>
+                <w:szCs w:val="26"/>
+              </w:rPr>
+              <w:t xml:space="preserve">✓</w:t>
             </w:r>
           </w:p>
         </w:tc>

</xml_diff>

<commit_message>
fix: align wrapper and bonafide tables, remove irregular borders, fix page breaks and layout
</commit_message>
<xml_diff>
--- a/AceAI_Badminton_Coach_Design_Thinking_Report.docx
+++ b/AceAI_Badminton_Coach_Design_Thinking_Report.docx
@@ -7,16 +7,16 @@
         <w:tblStyle w:val="TableGrid"/>
         <w:tblW w:w="9638" w:type="dxa"/>
         <w:tblInd w:w="-3" w:type="dxa"/>
-        <w:tblBorders>
-          <w:top w:val="single" w:sz="2" w:space="0" w:color="D0CECE" w:themeColor="background2" w:themeShade="E6"/>
-          <w:left w:val="single" w:sz="2" w:space="0" w:color="D0CECE" w:themeColor="background2" w:themeShade="E6"/>
-          <w:bottom w:val="single" w:sz="2" w:space="0" w:color="D0CECE" w:themeColor="background2" w:themeShade="E6"/>
-          <w:right w:val="single" w:sz="2" w:space="0" w:color="D0CECE" w:themeColor="background2" w:themeShade="E6"/>
-          <w:insideH w:val="single" w:sz="2" w:space="0" w:color="D0CECE" w:themeColor="background2" w:themeShade="E6"/>
-          <w:insideV w:val="single" w:sz="2" w:space="0" w:color="D0CECE" w:themeColor="background2" w:themeShade="E6"/>
-        </w:tblBorders>
         <w:tblLayout w:type="fixed"/>
         <w:tblLook w:val="04A0" w:firstRow="1" w:lastRow="0" w:firstColumn="1" w:lastColumn="0" w:noHBand="0" w:noVBand="1"/>
+        <w:tblBorders>
+          <w:top w:val="none" w:sz="0" w:space="0" w:color="auto"/>
+          <w:left w:val="none" w:sz="0" w:space="0" w:color="auto"/>
+          <w:bottom w:val="none" w:sz="0" w:space="0" w:color="auto"/>
+          <w:right w:val="none" w:sz="0" w:space="0" w:color="auto"/>
+          <w:insideH w:val="none" w:sz="0" w:space="0" w:color="auto"/>
+          <w:insideV w:val="none" w:sz="0" w:space="0" w:color="auto"/>
+        </w:tblBorders>
       </w:tblPr>
       <w:tblGrid>
         <w:gridCol w:w="1417"/>
@@ -33,6 +33,12 @@
           <w:tcPr>
             <w:tcW w:w="9638" w:type="dxa"/>
             <w:gridSpan w:val="5"/>
+            <w:tcBorders>
+              <w:top w:val="none" w:sz="0" w:space="0" w:color="auto"/>
+              <w:left w:val="none" w:sz="0" w:space="0" w:color="auto"/>
+              <w:bottom w:val="none" w:sz="0" w:space="0" w:color="auto"/>
+              <w:right w:val="none" w:sz="0" w:space="0" w:color="auto"/>
+            </w:tcBorders>
           </w:tcPr>
           <w:p>
             <w:pPr>
@@ -79,6 +85,12 @@
             <w:tcW w:w="2549" w:type="dxa"/>
             <w:gridSpan w:val="2"/>
             <w:vAlign w:val="bottom"/>
+            <w:tcBorders>
+              <w:top w:val="none" w:sz="0" w:space="0" w:color="auto"/>
+              <w:left w:val="none" w:sz="0" w:space="0" w:color="auto"/>
+              <w:bottom w:val="none" w:sz="0" w:space="0" w:color="auto"/>
+              <w:right w:val="none" w:sz="0" w:space="0" w:color="auto"/>
+            </w:tcBorders>
           </w:tcPr>
           <w:p>
             <w:pPr>
@@ -149,6 +161,12 @@
           <w:tcPr>
             <w:tcW w:w="7089" w:type="dxa"/>
             <w:gridSpan w:val="3"/>
+            <w:tcBorders>
+              <w:top w:val="none" w:sz="0" w:space="0" w:color="auto"/>
+              <w:left w:val="none" w:sz="0" w:space="0" w:color="auto"/>
+              <w:bottom w:val="none" w:sz="0" w:space="0" w:color="auto"/>
+              <w:right w:val="none" w:sz="0" w:space="0" w:color="auto"/>
+            </w:tcBorders>
           </w:tcPr>
           <w:p>
             <w:pPr>
@@ -296,13 +314,19 @@
       </w:tr>
       <w:tr>
         <w:trPr>
-          <w:trHeight w:val="1804"/>
+          <w:trHeight w:val="1300" w:hRule="atLeast"/>
         </w:trPr>
         <w:tc>
           <w:tcPr>
             <w:tcW w:w="2549" w:type="dxa"/>
             <w:gridSpan w:val="2"/>
             <w:vAlign w:val="bottom"/>
+            <w:tcBorders>
+              <w:top w:val="none" w:sz="0" w:space="0" w:color="auto"/>
+              <w:left w:val="none" w:sz="0" w:space="0" w:color="auto"/>
+              <w:bottom w:val="none" w:sz="0" w:space="0" w:color="auto"/>
+              <w:right w:val="none" w:sz="0" w:space="0" w:color="auto"/>
+            </w:tcBorders>
           </w:tcPr>
           <w:p>
             <w:pPr>
@@ -322,6 +346,12 @@
             <w:tcW w:w="7089" w:type="dxa"/>
             <w:gridSpan w:val="3"/>
             <w:vAlign w:val="center"/>
+            <w:tcBorders>
+              <w:top w:val="none" w:sz="0" w:space="0" w:color="auto"/>
+              <w:left w:val="none" w:sz="0" w:space="0" w:color="auto"/>
+              <w:bottom w:val="none" w:sz="0" w:space="0" w:color="auto"/>
+              <w:right w:val="none" w:sz="0" w:space="0" w:color="auto"/>
+            </w:tcBorders>
           </w:tcPr>
           <w:p>
             <w:pPr>
@@ -393,12 +423,18 @@
       </w:tr>
       <w:tr>
         <w:trPr>
-          <w:trHeight w:val="3587"/>
+          <w:trHeight w:val="2000" w:hRule="atLeast"/>
         </w:trPr>
         <w:tc>
           <w:tcPr>
             <w:tcW w:w="2549" w:type="dxa"/>
             <w:gridSpan w:val="2"/>
+            <w:tcBorders>
+              <w:top w:val="none" w:sz="0" w:space="0" w:color="auto"/>
+              <w:left w:val="none" w:sz="0" w:space="0" w:color="auto"/>
+              <w:bottom w:val="none" w:sz="0" w:space="0" w:color="auto"/>
+              <w:right w:val="none" w:sz="0" w:space="0" w:color="auto"/>
+            </w:tcBorders>
           </w:tcPr>
           <w:tbl>
             <w:tblPr>
@@ -426,6 +462,12 @@
                 <w:tcPr>
                   <w:tcW w:w="2330" w:type="dxa"/>
                   <w:vAlign w:val="center"/>
+                  <w:tcBorders>
+                    <w:top w:val="none" w:sz="0" w:space="0" w:color="auto"/>
+                    <w:left w:val="none" w:sz="0" w:space="0" w:color="auto"/>
+                    <w:bottom w:val="none" w:sz="0" w:space="0" w:color="auto"/>
+                    <w:right w:val="none" w:sz="0" w:space="0" w:color="auto"/>
+                  </w:tcBorders>
                 </w:tcPr>
                 <w:p>
                   <w:pPr>
@@ -493,43 +535,16 @@
             <w:tcW w:w="7089" w:type="dxa"/>
             <w:gridSpan w:val="3"/>
             <w:vAlign w:val="bottom"/>
-          </w:tcPr>
-          <w:p>
-            <w:pPr>
-              <w:spacing w:line="360" w:lineRule="auto"/>
-              <w:jc w:val="right"/>
-              <w:rPr>
-                <w:rFonts w:ascii="Arial" w:hAnsi="Arial" w:cs="Arial"/>
-                <w:spacing w:val="12"/>
-                <w:szCs w:val="24"/>
-              </w:rPr>
-            </w:pPr>
-          </w:p>
-          <w:p>
-            <w:pPr>
-              <w:spacing w:line="360" w:lineRule="auto"/>
-              <w:jc w:val="right"/>
-              <w:rPr>
-                <w:rFonts w:ascii="Arial" w:hAnsi="Arial" w:cs="Arial"/>
-                <w:spacing w:val="12"/>
-                <w:szCs w:val="24"/>
-              </w:rPr>
-            </w:pPr>
-          </w:p>
-          <w:p>
-            <w:pPr>
-              <w:spacing w:line="360" w:lineRule="auto"/>
-              <w:jc w:val="right"/>
-              <w:rPr>
-                <w:rFonts w:ascii="Arial" w:hAnsi="Arial" w:cs="Arial"/>
-                <w:spacing w:val="12"/>
-                <w:szCs w:val="24"/>
-              </w:rPr>
-            </w:pPr>
-          </w:p>
-          <w:p>
-            <w:pPr>
-              <w:spacing w:line="360" w:lineRule="auto"/>
+            <w:tcBorders>
+              <w:top w:val="none" w:sz="0" w:space="0" w:color="auto"/>
+              <w:left w:val="none" w:sz="0" w:space="0" w:color="auto"/>
+              <w:bottom w:val="none" w:sz="0" w:space="0" w:color="auto"/>
+              <w:right w:val="none" w:sz="0" w:space="0" w:color="auto"/>
+            </w:tcBorders>
+          </w:tcPr>
+          <w:p>
+            <w:pPr>
+              <w:spacing w:line="360" w:lineRule="auto" w:before="120" w:after="60"/>
               <w:jc w:val="right"/>
               <w:rPr>
                 <w:rFonts w:ascii="Arial" w:hAnsi="Arial" w:cs="Arial"/>
@@ -550,7 +565,7 @@
           </w:p>
           <w:p>
             <w:pPr>
-              <w:spacing w:line="360" w:lineRule="auto"/>
+              <w:spacing w:line="360" w:lineRule="auto" w:before="120" w:after="60"/>
               <w:jc w:val="right"/>
               <w:rPr>
                 <w:rFonts w:ascii="Arial" w:hAnsi="Arial" w:cs="Arial"/>
@@ -581,6 +596,12 @@
             <w:tcW w:w="2549" w:type="dxa"/>
             <w:gridSpan w:val="2"/>
             <w:vAlign w:val="center"/>
+            <w:tcBorders>
+              <w:top w:val="none" w:sz="0" w:space="0" w:color="auto"/>
+              <w:left w:val="none" w:sz="0" w:space="0" w:color="auto"/>
+              <w:bottom w:val="none" w:sz="0" w:space="0" w:color="auto"/>
+              <w:right w:val="none" w:sz="0" w:space="0" w:color="auto"/>
+            </w:tcBorders>
           </w:tcPr>
           <w:p>
             <w:pPr>
@@ -669,6 +690,12 @@
             <w:tcW w:w="7089" w:type="dxa"/>
             <w:gridSpan w:val="3"/>
             <w:vAlign w:val="bottom"/>
+            <w:tcBorders>
+              <w:top w:val="none" w:sz="0" w:space="0" w:color="auto"/>
+              <w:left w:val="none" w:sz="0" w:space="0" w:color="auto"/>
+              <w:bottom w:val="none" w:sz="0" w:space="0" w:color="auto"/>
+              <w:right w:val="none" w:sz="0" w:space="0" w:color="auto"/>
+            </w:tcBorders>
           </w:tcPr>
           <w:p>
             <w:pPr>
@@ -685,13 +712,19 @@
       </w:tr>
       <w:tr>
         <w:trPr>
-          <w:trHeight w:val="2551"/>
+          <w:trHeight w:val="1600" w:hRule="atLeast"/>
         </w:trPr>
         <w:tc>
           <w:tcPr>
             <w:tcW w:w="9638" w:type="dxa"/>
             <w:gridSpan w:val="5"/>
             <w:vAlign w:val="center"/>
+            <w:tcBorders>
+              <w:top w:val="none" w:sz="0" w:space="0" w:color="auto"/>
+              <w:left w:val="none" w:sz="0" w:space="0" w:color="auto"/>
+              <w:bottom w:val="none" w:sz="0" w:space="0" w:color="auto"/>
+              <w:right w:val="none" w:sz="0" w:space="0" w:color="auto"/>
+            </w:tcBorders>
           </w:tcPr>
           <w:p>
             <w:pPr>
@@ -818,6 +851,12 @@
           <w:tcPr>
             <w:tcW w:w="1417" w:type="dxa"/>
             <w:vAlign w:val="center"/>
+            <w:tcBorders>
+              <w:top w:val="none" w:sz="0" w:space="0" w:color="auto"/>
+              <w:left w:val="none" w:sz="0" w:space="0" w:color="auto"/>
+              <w:bottom w:val="none" w:sz="0" w:space="0" w:color="auto"/>
+              <w:right w:val="none" w:sz="0" w:space="0" w:color="auto"/>
+            </w:tcBorders>
           </w:tcPr>
           <w:p>
             <w:pPr>
@@ -893,6 +932,12 @@
             <w:tcW w:w="6525" w:type="dxa"/>
             <w:gridSpan w:val="3"/>
             <w:vAlign w:val="center"/>
+            <w:tcBorders>
+              <w:top w:val="none" w:sz="0" w:space="0" w:color="auto"/>
+              <w:left w:val="none" w:sz="0" w:space="0" w:color="auto"/>
+              <w:bottom w:val="none" w:sz="0" w:space="0" w:color="auto"/>
+              <w:right w:val="none" w:sz="0" w:space="0" w:color="auto"/>
+            </w:tcBorders>
           </w:tcPr>
           <w:p>
             <w:pPr>
@@ -1027,6 +1072,12 @@
           <w:tcPr>
             <w:tcW w:w="1696" w:type="dxa"/>
             <w:vAlign w:val="center"/>
+            <w:tcBorders>
+              <w:top w:val="none" w:sz="0" w:space="0" w:color="auto"/>
+              <w:left w:val="none" w:sz="0" w:space="0" w:color="auto"/>
+              <w:bottom w:val="none" w:sz="0" w:space="0" w:color="auto"/>
+              <w:right w:val="none" w:sz="0" w:space="0" w:color="auto"/>
+            </w:tcBorders>
           </w:tcPr>
           <w:p>
             <w:pPr>
@@ -1106,6 +1157,38 @@
           </w:p>
         </w:tc>
       </w:tr>
+    </w:tbl>
+    <w:p>
+      <w:pPr>
+        <w:spacing w:before="0" w:after="0" w:line="240" w:lineRule="auto"/>
+      </w:pPr>
+      <w:r>
+        <w:br w:type="page"/>
+      </w:r>
+    </w:p>
+    <w:tbl>
+      <w:tblPr>
+        <w:tblStyle w:val="TableGrid"/>
+        <w:tblW w:w="9638" w:type="dxa"/>
+        <w:tblInd w:w="-3" w:type="dxa"/>
+        <w:tblLayout w:type="fixed"/>
+        <w:tblLook w:val="04A0" w:firstRow="1" w:lastRow="0" w:firstColumn="1" w:lastColumn="0" w:noHBand="0" w:noVBand="1"/>
+        <w:tblBorders>
+          <w:top w:val="none" w:sz="0" w:space="0" w:color="auto"/>
+          <w:left w:val="none" w:sz="0" w:space="0" w:color="auto"/>
+          <w:bottom w:val="none" w:sz="0" w:space="0" w:color="auto"/>
+          <w:right w:val="none" w:sz="0" w:space="0" w:color="auto"/>
+          <w:insideH w:val="none" w:sz="0" w:space="0" w:color="auto"/>
+          <w:insideV w:val="none" w:sz="0" w:space="0" w:color="auto"/>
+        </w:tblBorders>
+      </w:tblPr>
+      <w:tblGrid>
+        <w:gridCol w:w="1417"/>
+        <w:gridCol w:w="1132"/>
+        <w:gridCol w:w="106"/>
+        <w:gridCol w:w="5287"/>
+        <w:gridCol w:w="1696"/>
+      </w:tblGrid>
       <w:tr>
         <w:tblPrEx>
           <w:tblBorders>
@@ -1124,6 +1207,12 @@
           <w:tcPr>
             <w:tcW w:w="9638" w:type="dxa"/>
             <w:gridSpan w:val="5"/>
+            <w:tcBorders>
+              <w:top w:val="none" w:sz="0" w:space="0" w:color="auto"/>
+              <w:left w:val="none" w:sz="0" w:space="0" w:color="auto"/>
+              <w:bottom w:val="none" w:sz="0" w:space="0" w:color="auto"/>
+              <w:right w:val="none" w:sz="0" w:space="0" w:color="auto"/>
+            </w:tcBorders>
           </w:tcPr>
           <w:p>
             <w:pPr>
@@ -1182,6 +1271,12 @@
             <w:tcW w:w="2655" w:type="dxa"/>
             <w:gridSpan w:val="3"/>
             <w:vAlign w:val="bottom"/>
+            <w:tcBorders>
+              <w:top w:val="none" w:sz="0" w:space="0" w:color="auto"/>
+              <w:left w:val="none" w:sz="0" w:space="0" w:color="auto"/>
+              <w:bottom w:val="none" w:sz="0" w:space="0" w:color="auto"/>
+              <w:right w:val="none" w:sz="0" w:space="0" w:color="auto"/>
+            </w:tcBorders>
           </w:tcPr>
           <w:p>
             <w:pPr>
@@ -1252,6 +1347,12 @@
           <w:tcPr>
             <w:tcW w:w="6983" w:type="dxa"/>
             <w:gridSpan w:val="2"/>
+            <w:tcBorders>
+              <w:top w:val="none" w:sz="0" w:space="0" w:color="auto"/>
+              <w:left w:val="none" w:sz="0" w:space="0" w:color="auto"/>
+              <w:bottom w:val="none" w:sz="0" w:space="0" w:color="auto"/>
+              <w:right w:val="none" w:sz="0" w:space="0" w:color="auto"/>
+            </w:tcBorders>
           </w:tcPr>
           <w:p>
             <w:pPr>
@@ -1438,13 +1539,19 @@
           </w:tblBorders>
         </w:tblPrEx>
         <w:trPr>
-          <w:trHeight w:val="1177"/>
+          <w:trHeight w:val="1300" w:hRule="atLeast"/>
         </w:trPr>
         <w:tc>
           <w:tcPr>
             <w:tcW w:w="2655" w:type="dxa"/>
             <w:gridSpan w:val="3"/>
             <w:vAlign w:val="bottom"/>
+            <w:tcBorders>
+              <w:top w:val="none" w:sz="0" w:space="0" w:color="auto"/>
+              <w:left w:val="none" w:sz="0" w:space="0" w:color="auto"/>
+              <w:bottom w:val="none" w:sz="0" w:space="0" w:color="auto"/>
+              <w:right w:val="none" w:sz="0" w:space="0" w:color="auto"/>
+            </w:tcBorders>
           </w:tcPr>
           <w:p>
             <w:pPr>
@@ -1475,6 +1582,12 @@
           <w:tcPr>
             <w:tcW w:w="6983" w:type="dxa"/>
             <w:gridSpan w:val="2"/>
+            <w:tcBorders>
+              <w:top w:val="none" w:sz="0" w:space="0" w:color="auto"/>
+              <w:left w:val="none" w:sz="0" w:space="0" w:color="auto"/>
+              <w:bottom w:val="none" w:sz="0" w:space="0" w:color="auto"/>
+              <w:right w:val="none" w:sz="0" w:space="0" w:color="auto"/>
+            </w:tcBorders>
           </w:tcPr>
           <w:p>
             <w:pPr>
@@ -1556,12 +1669,18 @@
           </w:tblBorders>
         </w:tblPrEx>
         <w:trPr>
-          <w:trHeight w:val="3587"/>
+          <w:trHeight w:val="2000" w:hRule="atLeast"/>
         </w:trPr>
         <w:tc>
           <w:tcPr>
             <w:tcW w:w="2655" w:type="dxa"/>
             <w:gridSpan w:val="3"/>
+            <w:tcBorders>
+              <w:top w:val="none" w:sz="0" w:space="0" w:color="auto"/>
+              <w:left w:val="none" w:sz="0" w:space="0" w:color="auto"/>
+              <w:bottom w:val="none" w:sz="0" w:space="0" w:color="auto"/>
+              <w:right w:val="none" w:sz="0" w:space="0" w:color="auto"/>
+            </w:tcBorders>
           </w:tcPr>
           <w:tbl>
             <w:tblPr>
@@ -1589,6 +1708,12 @@
                 <w:tcPr>
                   <w:tcW w:w="2330" w:type="dxa"/>
                   <w:vAlign w:val="center"/>
+                  <w:tcBorders>
+                    <w:top w:val="none" w:sz="0" w:space="0" w:color="auto"/>
+                    <w:left w:val="none" w:sz="0" w:space="0" w:color="auto"/>
+                    <w:bottom w:val="none" w:sz="0" w:space="0" w:color="auto"/>
+                    <w:right w:val="none" w:sz="0" w:space="0" w:color="auto"/>
+                  </w:tcBorders>
                 </w:tcPr>
                 <w:p>
                   <w:pPr>
@@ -1656,43 +1781,16 @@
             <w:tcW w:w="6983" w:type="dxa"/>
             <w:gridSpan w:val="2"/>
             <w:vAlign w:val="bottom"/>
-          </w:tcPr>
-          <w:p>
-            <w:pPr>
-              <w:spacing w:line="360" w:lineRule="auto"/>
-              <w:jc w:val="right"/>
-              <w:rPr>
-                <w:rFonts w:ascii="Arial" w:hAnsi="Arial" w:cs="Arial"/>
-                <w:spacing w:val="12"/>
-                <w:szCs w:val="24"/>
-              </w:rPr>
-            </w:pPr>
-          </w:p>
-          <w:p>
-            <w:pPr>
-              <w:spacing w:line="360" w:lineRule="auto"/>
-              <w:jc w:val="right"/>
-              <w:rPr>
-                <w:rFonts w:ascii="Arial" w:hAnsi="Arial" w:cs="Arial"/>
-                <w:spacing w:val="12"/>
-                <w:szCs w:val="24"/>
-              </w:rPr>
-            </w:pPr>
-          </w:p>
-          <w:p>
-            <w:pPr>
-              <w:spacing w:line="360" w:lineRule="auto"/>
-              <w:jc w:val="right"/>
-              <w:rPr>
-                <w:rFonts w:ascii="Arial" w:hAnsi="Arial" w:cs="Arial"/>
-                <w:spacing w:val="12"/>
-                <w:szCs w:val="24"/>
-              </w:rPr>
-            </w:pPr>
-          </w:p>
-          <w:p>
-            <w:pPr>
-              <w:spacing w:line="360" w:lineRule="auto"/>
+            <w:tcBorders>
+              <w:top w:val="none" w:sz="0" w:space="0" w:color="auto"/>
+              <w:left w:val="none" w:sz="0" w:space="0" w:color="auto"/>
+              <w:bottom w:val="none" w:sz="0" w:space="0" w:color="auto"/>
+              <w:right w:val="none" w:sz="0" w:space="0" w:color="auto"/>
+            </w:tcBorders>
+          </w:tcPr>
+          <w:p>
+            <w:pPr>
+              <w:spacing w:line="360" w:lineRule="auto" w:before="120" w:after="60"/>
               <w:jc w:val="right"/>
               <w:rPr>
                 <w:rFonts w:ascii="Arial" w:hAnsi="Arial" w:cs="Arial"/>
@@ -1713,7 +1811,7 @@
           </w:p>
           <w:p>
             <w:pPr>
-              <w:spacing w:line="360" w:lineRule="auto"/>
+              <w:spacing w:line="360" w:lineRule="auto" w:before="120" w:after="60"/>
               <w:jc w:val="right"/>
               <w:rPr>
                 <w:rFonts w:ascii="Arial" w:hAnsi="Arial" w:cs="Arial"/>
@@ -1754,6 +1852,12 @@
             <w:tcW w:w="2655" w:type="dxa"/>
             <w:gridSpan w:val="3"/>
             <w:vAlign w:val="center"/>
+            <w:tcBorders>
+              <w:top w:val="none" w:sz="0" w:space="0" w:color="auto"/>
+              <w:left w:val="none" w:sz="0" w:space="0" w:color="auto"/>
+              <w:bottom w:val="none" w:sz="0" w:space="0" w:color="auto"/>
+              <w:right w:val="none" w:sz="0" w:space="0" w:color="auto"/>
+            </w:tcBorders>
           </w:tcPr>
           <w:p>
             <w:pPr>
@@ -1842,6 +1946,12 @@
             <w:tcW w:w="6983" w:type="dxa"/>
             <w:gridSpan w:val="2"/>
             <w:vAlign w:val="bottom"/>
+            <w:tcBorders>
+              <w:top w:val="none" w:sz="0" w:space="0" w:color="auto"/>
+              <w:left w:val="none" w:sz="0" w:space="0" w:color="auto"/>
+              <w:bottom w:val="none" w:sz="0" w:space="0" w:color="auto"/>
+              <w:right w:val="none" w:sz="0" w:space="0" w:color="auto"/>
+            </w:tcBorders>
           </w:tcPr>
           <w:p>
             <w:pPr>
@@ -1868,13 +1978,19 @@
           </w:tblBorders>
         </w:tblPrEx>
         <w:trPr>
-          <w:trHeight w:val="2358"/>
+          <w:trHeight w:val="1600" w:hRule="atLeast"/>
         </w:trPr>
         <w:tc>
           <w:tcPr>
             <w:tcW w:w="9638" w:type="dxa"/>
             <w:gridSpan w:val="5"/>
             <w:vAlign w:val="center"/>
+            <w:tcBorders>
+              <w:top w:val="none" w:sz="0" w:space="0" w:color="auto"/>
+              <w:left w:val="none" w:sz="0" w:space="0" w:color="auto"/>
+              <w:bottom w:val="none" w:sz="0" w:space="0" w:color="auto"/>
+              <w:right w:val="none" w:sz="0" w:space="0" w:color="auto"/>
+            </w:tcBorders>
           </w:tcPr>
           <w:p>
             <w:pPr>
@@ -1999,6 +2115,12 @@
           <w:tcPr>
             <w:tcW w:w="1417" w:type="dxa"/>
             <w:vAlign w:val="center"/>
+            <w:tcBorders>
+              <w:top w:val="none" w:sz="0" w:space="0" w:color="auto"/>
+              <w:left w:val="none" w:sz="0" w:space="0" w:color="auto"/>
+              <w:bottom w:val="none" w:sz="0" w:space="0" w:color="auto"/>
+              <w:right w:val="none" w:sz="0" w:space="0" w:color="auto"/>
+            </w:tcBorders>
           </w:tcPr>
           <w:p>
             <w:pPr>
@@ -2074,6 +2196,12 @@
             <w:tcW w:w="6525" w:type="dxa"/>
             <w:gridSpan w:val="3"/>
             <w:vAlign w:val="center"/>
+            <w:tcBorders>
+              <w:top w:val="none" w:sz="0" w:space="0" w:color="auto"/>
+              <w:left w:val="none" w:sz="0" w:space="0" w:color="auto"/>
+              <w:bottom w:val="none" w:sz="0" w:space="0" w:color="auto"/>
+              <w:right w:val="none" w:sz="0" w:space="0" w:color="auto"/>
+            </w:tcBorders>
           </w:tcPr>
           <w:p>
             <w:pPr>
@@ -2189,6 +2317,12 @@
           <w:tcPr>
             <w:tcW w:w="1696" w:type="dxa"/>
             <w:vAlign w:val="center"/>
+            <w:tcBorders>
+              <w:top w:val="none" w:sz="0" w:space="0" w:color="auto"/>
+              <w:left w:val="none" w:sz="0" w:space="0" w:color="auto"/>
+              <w:bottom w:val="none" w:sz="0" w:space="0" w:color="auto"/>
+              <w:right w:val="none" w:sz="0" w:space="0" w:color="auto"/>
+            </w:tcBorders>
           </w:tcPr>
           <w:p>
             <w:pPr>
@@ -2271,6 +2405,14 @@
     </w:tbl>
     <w:p>
       <w:pPr>
+        <w:spacing w:before="0" w:after="0" w:line="240" w:lineRule="auto"/>
+      </w:pPr>
+      <w:r>
+        <w:br w:type="page"/>
+      </w:r>
+    </w:p>
+    <w:p>
+      <w:pPr>
         <w:autoSpaceDE w:val="0"/>
         <w:autoSpaceDN w:val="0"/>
         <w:adjustRightInd w:val="0"/>
@@ -2343,34 +2485,7 @@
         <w:autoSpaceDE w:val="0"/>
         <w:autoSpaceDN w:val="0"/>
         <w:adjustRightInd w:val="0"/>
-        <w:spacing w:before="240" w:after="0"/>
-        <w:jc w:val="center"/>
-        <w:rPr>
-          <w:rFonts w:ascii="Arial" w:hAnsi="Arial" w:cs="Arial"/>
-          <w:sz w:val="20"/>
-          <w:szCs w:val="20"/>
-        </w:rPr>
-      </w:pPr>
-    </w:p>
-    <w:p>
-      <w:pPr>
-        <w:autoSpaceDE w:val="0"/>
-        <w:autoSpaceDN w:val="0"/>
-        <w:adjustRightInd w:val="0"/>
-        <w:spacing w:line="38" w:lineRule="exact"/>
-        <w:rPr>
-          <w:rFonts w:ascii="Arial" w:hAnsi="Arial" w:cs="Arial"/>
-          <w:sz w:val="20"/>
-          <w:szCs w:val="20"/>
-        </w:rPr>
-      </w:pPr>
-    </w:p>
-    <w:p>
-      <w:pPr>
-        <w:autoSpaceDE w:val="0"/>
-        <w:autoSpaceDN w:val="0"/>
-        <w:adjustRightInd w:val="0"/>
-        <w:spacing w:before="240" w:after="240"/>
+        <w:spacing w:before="180" w:after="180"/>
         <w:jc w:val="center"/>
         <w:rPr>
           <w:rFonts w:ascii="Arial" w:hAnsi="Arial" w:cs="Arial"/>
@@ -2396,22 +2511,7 @@
         <w:autoSpaceDE w:val="0"/>
         <w:autoSpaceDN w:val="0"/>
         <w:adjustRightInd w:val="0"/>
-        <w:spacing w:before="240" w:after="240"/>
-        <w:jc w:val="center"/>
-        <w:rPr>
-          <w:rFonts w:ascii="Arial" w:hAnsi="Arial" w:cs="Arial"/>
-          <w:b/>
-          <w:sz w:val="20"/>
-          <w:szCs w:val="20"/>
-        </w:rPr>
-      </w:pPr>
-    </w:p>
-    <w:p>
-      <w:pPr>
-        <w:autoSpaceDE w:val="0"/>
-        <w:autoSpaceDN w:val="0"/>
-        <w:adjustRightInd w:val="0"/>
-        <w:spacing w:after="0" w:line="480" w:lineRule="auto"/>
+        <w:spacing w:after="120" w:line="320" w:lineRule="auto" w:before="120"/>
         <w:jc w:val="both"/>
         <w:rPr>
           <w:rFonts w:ascii="Arial" w:hAnsi="Arial" w:cs="Arial"/>
@@ -2499,6 +2599,7 @@
         <w:tblStyle w:val="TableGrid"/>
         <w:tblW w:w="0" w:type="auto"/>
         <w:jc w:val="center"/>
+        <w:tblLook w:val="04A0" w:firstRow="1" w:lastRow="0" w:firstColumn="1" w:lastColumn="0" w:noHBand="0" w:noVBand="1"/>
         <w:tblBorders>
           <w:top w:val="none" w:sz="0" w:space="0" w:color="auto"/>
           <w:left w:val="none" w:sz="0" w:space="0" w:color="auto"/>
@@ -2507,7 +2608,6 @@
           <w:insideH w:val="none" w:sz="0" w:space="0" w:color="auto"/>
           <w:insideV w:val="none" w:sz="0" w:space="0" w:color="auto"/>
         </w:tblBorders>
-        <w:tblLook w:val="04A0" w:firstRow="1" w:lastRow="0" w:firstColumn="1" w:lastColumn="0" w:noHBand="0" w:noVBand="1"/>
       </w:tblPr>
       <w:tblGrid>
         <w:gridCol w:w="4108"/>
@@ -2521,6 +2621,12 @@
         <w:tc>
           <w:tcPr>
             <w:tcW w:w="4108" w:type="dxa"/>
+            <w:tcBorders>
+              <w:top w:val="none" w:sz="0" w:space="0" w:color="auto"/>
+              <w:left w:val="none" w:sz="0" w:space="0" w:color="auto"/>
+              <w:bottom w:val="none" w:sz="0" w:space="0" w:color="auto"/>
+              <w:right w:val="none" w:sz="0" w:space="0" w:color="auto"/>
+            </w:tcBorders>
           </w:tcPr>
           <w:p>
             <w:pPr>
@@ -2528,7 +2634,7 @@
               <w:autoSpaceDN w:val="0"/>
               <w:adjustRightInd w:val="0"/>
               <w:spacing w:line="480" w:lineRule="auto"/>
-              <w:jc w:val="both"/>
+              <w:jc w:val="center"/>
               <w:rPr>
                 <w:rFonts w:ascii="Arial" w:hAnsi="Arial" w:cs="Arial"/>
                 <w:b/>
@@ -2539,29 +2645,23 @@
             </w:pPr>
             <w:r>
               <w:rPr>
-                <w:rFonts w:ascii="Arial" w:hAnsi="Arial" w:cs="Arial"/>
+                <w:rFonts w:ascii="Arial" w:hAnsi="Arial"/>
                 <w:b/>
-                <w:spacing w:val="12"/>
                 <w:sz w:val="24"/>
-                <w:szCs w:val="24"/>
-              </w:rPr>
-              <w:t>A</w:t>
-            </w:r>
-            <w:r>
-              <w:rPr>
-                <w:rFonts w:ascii="Arial" w:hAnsi="Arial" w:cs="Arial"/>
-                <w:b/>
-                <w:spacing w:val="12"/>
-                <w:sz w:val="24"/>
-                <w:szCs w:val="24"/>
-              </w:rPr>
-              <w:t>BISHEIK RAJA S T</w:t>
+              </w:rPr>
+              <w:t>ABHISHEIK RAJA S T</w:t>
             </w:r>
           </w:p>
         </w:tc>
         <w:tc>
           <w:tcPr>
             <w:tcW w:w="3000" w:type="dxa"/>
+            <w:tcBorders>
+              <w:top w:val="none" w:sz="0" w:space="0" w:color="auto"/>
+              <w:left w:val="none" w:sz="0" w:space="0" w:color="auto"/>
+              <w:bottom w:val="none" w:sz="0" w:space="0" w:color="auto"/>
+              <w:right w:val="none" w:sz="0" w:space="0" w:color="auto"/>
+            </w:tcBorders>
           </w:tcPr>
           <w:p>
             <w:pPr>
@@ -2569,7 +2669,7 @@
               <w:autoSpaceDN w:val="0"/>
               <w:adjustRightInd w:val="0"/>
               <w:spacing w:line="480" w:lineRule="auto"/>
-              <w:jc w:val="both"/>
+              <w:jc w:val="center"/>
               <w:rPr>
                 <w:rFonts w:ascii="Arial" w:hAnsi="Arial" w:cs="Arial"/>
                 <w:b/>
@@ -2580,23 +2680,11 @@
             </w:pPr>
             <w:r>
               <w:rPr>
-                <w:rFonts w:ascii="Arial" w:hAnsi="Arial" w:cs="Arial"/>
+                <w:rFonts w:ascii="Arial" w:hAnsi="Arial"/>
                 <w:b/>
-                <w:spacing w:val="12"/>
                 <w:sz w:val="24"/>
-                <w:szCs w:val="24"/>
-              </w:rPr>
-              <w:t>7228</w:t>
-            </w:r>
-            <w:r>
-              <w:rPr>
-                <w:rFonts w:ascii="Arial" w:hAnsi="Arial" w:cs="Arial"/>
-                <w:b/>
-                <w:spacing w:val="12"/>
-                <w:sz w:val="24"/>
-                <w:szCs w:val="24"/>
-              </w:rPr>
-              <w:t>25104001</w:t>
+              </w:rPr>
+              <w:t>722825104001</w:t>
             </w:r>
           </w:p>
         </w:tc>
@@ -2607,56 +2695,36 @@
         <w:autoSpaceDE w:val="0"/>
         <w:autoSpaceDN w:val="0"/>
         <w:adjustRightInd w:val="0"/>
-        <w:spacing w:after="0" w:line="480" w:lineRule="auto"/>
+        <w:spacing w:after="180" w:line="480" w:lineRule="auto" w:before="120"/>
         <w:jc w:val="both"/>
+        <w:rPr>
+          <w:rFonts w:ascii="Arial" w:hAnsi="Arial" w:cs="Arial"/>
+          <w:sz w:val="24"/>
+          <w:szCs w:val="20"/>
+        </w:rPr>
+      </w:pPr>
+      <w:r>
         <w:rPr>
           <w:rFonts w:ascii="Arial" w:hAnsi="Arial" w:cs="Arial"/>
           <w:sz w:val="28"/>
           <w:szCs w:val="20"/>
         </w:rPr>
-      </w:pPr>
-    </w:p>
-    <w:p>
-      <w:pPr>
-        <w:autoSpaceDE w:val="0"/>
-        <w:autoSpaceDN w:val="0"/>
-        <w:adjustRightInd w:val="0"/>
-        <w:spacing w:after="0" w:line="480" w:lineRule="auto"/>
-        <w:jc w:val="both"/>
-        <w:rPr>
-          <w:rFonts w:ascii="Arial" w:hAnsi="Arial" w:cs="Arial"/>
-          <w:sz w:val="24"/>
-          <w:szCs w:val="20"/>
-        </w:rPr>
-      </w:pPr>
-      <w:r>
-        <w:rPr>
-          <w:rFonts w:ascii="Arial" w:hAnsi="Arial" w:cs="Arial"/>
-          <w:sz w:val="28"/>
-          <w:szCs w:val="20"/>
-        </w:rPr>
         <w:t>who carried out the project work under my supervision.</w:t>
       </w:r>
-    </w:p>
-    <w:p>
-      <w:pPr>
-        <w:autoSpaceDE w:val="0"/>
-        <w:autoSpaceDN w:val="0"/>
-        <w:adjustRightInd w:val="0"/>
-        <w:spacing w:after="0" w:line="360" w:lineRule="auto"/>
-        <w:jc w:val="both"/>
-        <w:rPr>
-          <w:rFonts w:ascii="Arial" w:hAnsi="Arial" w:cs="Arial"/>
-          <w:sz w:val="20"/>
-          <w:szCs w:val="20"/>
-        </w:rPr>
-      </w:pPr>
     </w:p>
     <w:tbl>
       <w:tblPr>
         <w:tblW w:w="5000" w:type="pct"/>
         <w:jc w:val="center"/>
         <w:tblLook w:val="0000" w:firstRow="0" w:lastRow="0" w:firstColumn="0" w:lastColumn="0" w:noHBand="0" w:noVBand="0"/>
+        <w:tblBorders>
+          <w:top w:val="none" w:sz="0" w:space="0" w:color="auto"/>
+          <w:left w:val="none" w:sz="0" w:space="0" w:color="auto"/>
+          <w:bottom w:val="none" w:sz="0" w:space="0" w:color="auto"/>
+          <w:right w:val="none" w:sz="0" w:space="0" w:color="auto"/>
+          <w:insideH w:val="none" w:sz="0" w:space="0" w:color="auto"/>
+          <w:insideV w:val="none" w:sz="0" w:space="0" w:color="auto"/>
+        </w:tblBorders>
       </w:tblPr>
       <w:tblGrid>
         <w:gridCol w:w="5179"/>
@@ -2669,15 +2737,21 @@
         </w:trPr>
         <w:tc>
           <w:tcPr>
-            <w:tcW w:w="2687" w:type="pct"/>
+            <w:tcW w:w="4814" w:type="dxa"/>
+            <w:tcBorders>
+              <w:top w:val="none" w:sz="0" w:space="0" w:color="auto"/>
+              <w:left w:val="none" w:sz="0" w:space="0" w:color="auto"/>
+              <w:bottom w:val="none" w:sz="0" w:space="0" w:color="auto"/>
+              <w:right w:val="none" w:sz="0" w:space="0" w:color="auto"/>
+            </w:tcBorders>
           </w:tcPr>
           <w:p>
             <w:pPr>
               <w:autoSpaceDE w:val="0"/>
               <w:autoSpaceDN w:val="0"/>
               <w:adjustRightInd w:val="0"/>
-              <w:spacing w:after="0" w:line="360" w:lineRule="auto"/>
-              <w:jc w:val="both"/>
+              <w:spacing w:after="0" w:line="360" w:lineRule="auto" w:before="140"/>
+              <w:jc w:val="center"/>
               <w:rPr>
                 <w:rFonts w:ascii="Arial" w:hAnsi="Arial" w:cs="Arial"/>
                 <w:sz w:val="24"/>
@@ -2686,54 +2760,42 @@
             </w:pPr>
             <w:r>
               <w:rPr>
+                <w:rFonts w:ascii="Arial" w:hAnsi="Arial"/>
+                <w:sz w:val="24"/>
+              </w:rPr>
+              <w:t>_________________________</w:t>
+            </w:r>
+          </w:p>
+        </w:tc>
+        <w:tc>
+          <w:tcPr>
+            <w:tcW w:w="4814" w:type="dxa"/>
+            <w:tcBorders>
+              <w:top w:val="none" w:sz="0" w:space="0" w:color="auto"/>
+              <w:left w:val="none" w:sz="0" w:space="0" w:color="auto"/>
+              <w:bottom w:val="none" w:sz="0" w:space="0" w:color="auto"/>
+              <w:right w:val="none" w:sz="0" w:space="0" w:color="auto"/>
+            </w:tcBorders>
+          </w:tcPr>
+          <w:p>
+            <w:pPr>
+              <w:autoSpaceDE w:val="0"/>
+              <w:autoSpaceDN w:val="0"/>
+              <w:adjustRightInd w:val="0"/>
+              <w:spacing w:after="0" w:line="360" w:lineRule="auto" w:before="140"/>
+              <w:jc w:val="center"/>
+              <w:rPr>
                 <w:rFonts w:ascii="Arial" w:hAnsi="Arial" w:cs="Arial"/>
                 <w:sz w:val="24"/>
                 <w:szCs w:val="24"/>
               </w:rPr>
-              <w:t>--------------------------------</w:t>
-            </w:r>
-            <w:r>
-              <w:rPr>
-                <w:rFonts w:ascii="Arial" w:hAnsi="Arial" w:cs="Arial"/>
+            </w:pPr>
+            <w:r>
+              <w:rPr>
+                <w:rFonts w:ascii="Arial" w:hAnsi="Arial"/>
                 <w:sz w:val="24"/>
-                <w:szCs w:val="24"/>
-              </w:rPr>
-              <w:t>---------</w:t>
-            </w:r>
-          </w:p>
-        </w:tc>
-        <w:tc>
-          <w:tcPr>
-            <w:tcW w:w="2313" w:type="pct"/>
-          </w:tcPr>
-          <w:p>
-            <w:pPr>
-              <w:autoSpaceDE w:val="0"/>
-              <w:autoSpaceDN w:val="0"/>
-              <w:adjustRightInd w:val="0"/>
-              <w:spacing w:after="0" w:line="360" w:lineRule="auto"/>
-              <w:jc w:val="both"/>
-              <w:rPr>
-                <w:rFonts w:ascii="Arial" w:hAnsi="Arial" w:cs="Arial"/>
-                <w:sz w:val="24"/>
-                <w:szCs w:val="24"/>
-              </w:rPr>
-            </w:pPr>
-            <w:r>
-              <w:rPr>
-                <w:rFonts w:ascii="Arial" w:hAnsi="Arial" w:cs="Arial"/>
-                <w:sz w:val="24"/>
-                <w:szCs w:val="24"/>
-              </w:rPr>
-              <w:t>--------------------------------</w:t>
-            </w:r>
-            <w:r>
-              <w:rPr>
-                <w:rFonts w:ascii="Arial" w:hAnsi="Arial" w:cs="Arial"/>
-                <w:sz w:val="24"/>
-                <w:szCs w:val="24"/>
-              </w:rPr>
-              <w:t>---------</w:t>
+              </w:rPr>
+              <w:t>_________________________</w:t>
             </w:r>
           </w:p>
         </w:tc>
@@ -2745,15 +2807,21 @@
         </w:trPr>
         <w:tc>
           <w:tcPr>
-            <w:tcW w:w="2687" w:type="pct"/>
+            <w:tcW w:w="4814" w:type="dxa"/>
+            <w:tcBorders>
+              <w:top w:val="none" w:sz="0" w:space="0" w:color="auto"/>
+              <w:left w:val="none" w:sz="0" w:space="0" w:color="auto"/>
+              <w:bottom w:val="none" w:sz="0" w:space="0" w:color="auto"/>
+              <w:right w:val="none" w:sz="0" w:space="0" w:color="auto"/>
+            </w:tcBorders>
           </w:tcPr>
           <w:p>
             <w:pPr>
               <w:autoSpaceDE w:val="0"/>
               <w:autoSpaceDN w:val="0"/>
               <w:adjustRightInd w:val="0"/>
-              <w:spacing w:after="0" w:line="360" w:lineRule="auto"/>
-              <w:jc w:val="both"/>
+              <w:spacing w:after="80" w:line="360" w:lineRule="auto" w:before="30"/>
+              <w:jc w:val="center"/>
               <w:rPr>
                 <w:rFonts w:ascii="Arial" w:hAnsi="Arial" w:cs="Arial"/>
                 <w:sz w:val="24"/>
@@ -2773,15 +2841,21 @@
         </w:tc>
         <w:tc>
           <w:tcPr>
-            <w:tcW w:w="2313" w:type="pct"/>
+            <w:tcW w:w="4814" w:type="dxa"/>
+            <w:tcBorders>
+              <w:top w:val="none" w:sz="0" w:space="0" w:color="auto"/>
+              <w:left w:val="none" w:sz="0" w:space="0" w:color="auto"/>
+              <w:bottom w:val="none" w:sz="0" w:space="0" w:color="auto"/>
+              <w:right w:val="none" w:sz="0" w:space="0" w:color="auto"/>
+            </w:tcBorders>
           </w:tcPr>
           <w:p>
             <w:pPr>
               <w:autoSpaceDE w:val="0"/>
               <w:autoSpaceDN w:val="0"/>
               <w:adjustRightInd w:val="0"/>
-              <w:spacing w:after="0" w:line="360" w:lineRule="auto"/>
-              <w:jc w:val="both"/>
+              <w:spacing w:after="80" w:line="360" w:lineRule="auto" w:before="30"/>
+              <w:jc w:val="center"/>
               <w:rPr>
                 <w:rFonts w:ascii="Arial" w:hAnsi="Arial" w:cs="Arial"/>
                 <w:b/>
@@ -2808,15 +2882,21 @@
         </w:trPr>
         <w:tc>
           <w:tcPr>
-            <w:tcW w:w="2687" w:type="pct"/>
+            <w:tcW w:w="4814" w:type="dxa"/>
+            <w:tcBorders>
+              <w:top w:val="none" w:sz="0" w:space="0" w:color="auto"/>
+              <w:left w:val="none" w:sz="0" w:space="0" w:color="auto"/>
+              <w:bottom w:val="none" w:sz="0" w:space="0" w:color="auto"/>
+              <w:right w:val="none" w:sz="0" w:space="0" w:color="auto"/>
+            </w:tcBorders>
           </w:tcPr>
           <w:p>
             <w:pPr>
               <w:autoSpaceDE w:val="0"/>
               <w:autoSpaceDN w:val="0"/>
               <w:adjustRightInd w:val="0"/>
-              <w:spacing w:after="0" w:line="360" w:lineRule="auto"/>
-              <w:jc w:val="both"/>
+              <w:spacing w:after="0" w:line="240" w:lineRule="auto" w:before="0"/>
+              <w:jc w:val="center"/>
               <w:rPr>
                 <w:rFonts w:ascii="Arial" w:hAnsi="Arial" w:cs="Arial"/>
                 <w:sz w:val="24"/>
@@ -2888,8 +2968,8 @@
               <w:autoSpaceDE w:val="0"/>
               <w:autoSpaceDN w:val="0"/>
               <w:adjustRightInd w:val="0"/>
-              <w:spacing w:after="0" w:line="360" w:lineRule="auto"/>
-              <w:jc w:val="both"/>
+              <w:spacing w:after="0" w:line="240" w:lineRule="auto" w:before="0"/>
+              <w:jc w:val="center"/>
               <w:rPr>
                 <w:rFonts w:ascii="Arial" w:hAnsi="Arial" w:cs="Arial"/>
                 <w:b/>
@@ -2912,8 +2992,8 @@
               <w:autoSpaceDE w:val="0"/>
               <w:autoSpaceDN w:val="0"/>
               <w:adjustRightInd w:val="0"/>
-              <w:spacing w:after="0" w:line="360" w:lineRule="auto"/>
-              <w:jc w:val="both"/>
+              <w:spacing w:after="0" w:line="240" w:lineRule="auto" w:before="0"/>
+              <w:jc w:val="center"/>
               <w:rPr>
                 <w:rFonts w:ascii="Arial" w:hAnsi="Arial" w:cs="Arial"/>
                 <w:sz w:val="24"/>
@@ -2942,12 +3022,13 @@
               <w:autoSpaceDE w:val="0"/>
               <w:autoSpaceDN w:val="0"/>
               <w:adjustRightInd w:val="0"/>
-              <w:spacing w:after="0" w:line="360" w:lineRule="auto"/>
+              <w:spacing w:after="0" w:line="240" w:lineRule="auto" w:before="0"/>
               <w:rPr>
                 <w:rFonts w:ascii="Arial" w:hAnsi="Arial" w:cs="Arial"/>
                 <w:sz w:val="24"/>
                 <w:szCs w:val="24"/>
               </w:rPr>
+              <w:jc w:val="center"/>
             </w:pPr>
             <w:r>
               <w:rPr>
@@ -2971,13 +3052,14 @@
               <w:autoSpaceDE w:val="0"/>
               <w:autoSpaceDN w:val="0"/>
               <w:adjustRightInd w:val="0"/>
-              <w:spacing w:after="0" w:line="360" w:lineRule="auto"/>
+              <w:spacing w:after="0" w:line="240" w:lineRule="auto" w:before="0"/>
               <w:rPr>
                 <w:rFonts w:ascii="Arial" w:hAnsi="Arial" w:cs="Arial"/>
                 <w:b/>
                 <w:sz w:val="24"/>
                 <w:szCs w:val="24"/>
               </w:rPr>
+              <w:jc w:val="center"/>
             </w:pPr>
             <w:r>
               <w:rPr>
@@ -2991,15 +3073,21 @@
         </w:tc>
         <w:tc>
           <w:tcPr>
-            <w:tcW w:w="2313" w:type="pct"/>
+            <w:tcW w:w="4814" w:type="dxa"/>
+            <w:tcBorders>
+              <w:top w:val="none" w:sz="0" w:space="0" w:color="auto"/>
+              <w:left w:val="none" w:sz="0" w:space="0" w:color="auto"/>
+              <w:bottom w:val="none" w:sz="0" w:space="0" w:color="auto"/>
+              <w:right w:val="none" w:sz="0" w:space="0" w:color="auto"/>
+            </w:tcBorders>
           </w:tcPr>
           <w:p>
             <w:pPr>
               <w:autoSpaceDE w:val="0"/>
               <w:autoSpaceDN w:val="0"/>
               <w:adjustRightInd w:val="0"/>
-              <w:spacing w:after="0" w:line="360" w:lineRule="auto"/>
-              <w:jc w:val="both"/>
+              <w:spacing w:after="0" w:line="240" w:lineRule="auto" w:before="0"/>
+              <w:jc w:val="center"/>
               <w:rPr>
                 <w:rFonts w:ascii="Arial" w:hAnsi="Arial" w:cs="Arial"/>
                 <w:sz w:val="24"/>
@@ -3040,8 +3128,8 @@
               <w:autoSpaceDE w:val="0"/>
               <w:autoSpaceDN w:val="0"/>
               <w:adjustRightInd w:val="0"/>
-              <w:spacing w:after="0" w:line="360" w:lineRule="auto"/>
-              <w:jc w:val="both"/>
+              <w:spacing w:after="0" w:line="240" w:lineRule="auto" w:before="0"/>
+              <w:jc w:val="center"/>
               <w:rPr>
                 <w:rFonts w:ascii="Arial" w:hAnsi="Arial" w:cs="Arial"/>
                 <w:b/>
@@ -3064,8 +3152,8 @@
               <w:autoSpaceDE w:val="0"/>
               <w:autoSpaceDN w:val="0"/>
               <w:adjustRightInd w:val="0"/>
-              <w:spacing w:after="0" w:line="360" w:lineRule="auto"/>
-              <w:jc w:val="both"/>
+              <w:spacing w:after="0" w:line="240" w:lineRule="auto" w:before="0"/>
+              <w:jc w:val="center"/>
               <w:rPr>
                 <w:rFonts w:ascii="Arial" w:hAnsi="Arial" w:cs="Arial"/>
                 <w:sz w:val="24"/>
@@ -3086,8 +3174,8 @@
               <w:autoSpaceDE w:val="0"/>
               <w:autoSpaceDN w:val="0"/>
               <w:adjustRightInd w:val="0"/>
-              <w:spacing w:after="0" w:line="360" w:lineRule="auto"/>
-              <w:jc w:val="both"/>
+              <w:spacing w:after="0" w:line="240" w:lineRule="auto" w:before="0"/>
+              <w:jc w:val="center"/>
               <w:rPr>
                 <w:rFonts w:ascii="Arial" w:hAnsi="Arial" w:cs="Arial"/>
                 <w:sz w:val="24"/>
@@ -3124,12 +3212,13 @@
               <w:autoSpaceDE w:val="0"/>
               <w:autoSpaceDN w:val="0"/>
               <w:adjustRightInd w:val="0"/>
-              <w:spacing w:after="0" w:line="360" w:lineRule="auto"/>
+              <w:spacing w:after="0" w:line="240" w:lineRule="auto" w:before="0"/>
               <w:rPr>
                 <w:rFonts w:ascii="Arial" w:hAnsi="Arial" w:cs="Arial"/>
                 <w:sz w:val="24"/>
                 <w:szCs w:val="24"/>
               </w:rPr>
+              <w:jc w:val="center"/>
             </w:pPr>
             <w:r>
               <w:rPr>
@@ -3153,13 +3242,14 @@
               <w:autoSpaceDE w:val="0"/>
               <w:autoSpaceDN w:val="0"/>
               <w:adjustRightInd w:val="0"/>
-              <w:spacing w:after="0" w:line="360" w:lineRule="auto"/>
+              <w:spacing w:after="0" w:line="240" w:lineRule="auto" w:before="0"/>
               <w:rPr>
                 <w:rFonts w:ascii="Arial" w:hAnsi="Arial" w:cs="Arial"/>
                 <w:b/>
                 <w:sz w:val="24"/>
                 <w:szCs w:val="24"/>
               </w:rPr>
+              <w:jc w:val="center"/>
             </w:pPr>
             <w:r>
               <w:rPr>
@@ -3173,19 +3263,11 @@
         </w:tc>
       </w:tr>
     </w:tbl>
-    <w:p>
-      <w:pPr>
-        <w:rPr>
-          <w:rFonts w:ascii="Arial" w:hAnsi="Arial" w:cs="Arial"/>
-          <w:sz w:val="20"/>
-          <w:szCs w:val="20"/>
-        </w:rPr>
-      </w:pPr>
-    </w:p>
     <w:tbl>
       <w:tblPr>
         <w:tblStyle w:val="TableGrid"/>
         <w:tblW w:w="0" w:type="auto"/>
+        <w:tblLook w:val="04A0" w:firstRow="1" w:lastRow="0" w:firstColumn="1" w:lastColumn="0" w:noHBand="0" w:noVBand="1"/>
         <w:tblBorders>
           <w:top w:val="none" w:sz="0" w:space="0" w:color="auto"/>
           <w:left w:val="none" w:sz="0" w:space="0" w:color="auto"/>
@@ -3194,7 +3276,6 @@
           <w:insideH w:val="none" w:sz="0" w:space="0" w:color="auto"/>
           <w:insideV w:val="none" w:sz="0" w:space="0" w:color="auto"/>
         </w:tblBorders>
-        <w:tblLook w:val="04A0" w:firstRow="1" w:lastRow="0" w:firstColumn="1" w:lastColumn="0" w:noHBand="0" w:noVBand="1"/>
       </w:tblPr>
       <w:tblGrid>
         <w:gridCol w:w="4814"/>
@@ -3208,10 +3289,16 @@
           <w:tcPr>
             <w:tcW w:w="9628" w:type="dxa"/>
             <w:gridSpan w:val="2"/>
-          </w:tcPr>
-          <w:p>
-            <w:pPr>
-              <w:spacing w:line="480" w:lineRule="auto"/>
+            <w:tcBorders>
+              <w:top w:val="none" w:sz="0" w:space="0" w:color="auto"/>
+              <w:left w:val="none" w:sz="0" w:space="0" w:color="auto"/>
+              <w:bottom w:val="none" w:sz="0" w:space="0" w:color="auto"/>
+              <w:right w:val="none" w:sz="0" w:space="0" w:color="auto"/>
+            </w:tcBorders>
+          </w:tcPr>
+          <w:p>
+            <w:pPr>
+              <w:spacing w:line="260" w:lineRule="auto" w:before="80" w:after="80"/>
               <w:jc w:val="both"/>
               <w:rPr>
                 <w:rFonts w:ascii="Arial" w:hAnsi="Arial" w:cs="Arial"/>
@@ -3305,30 +3392,18 @@
               <w:t>…….</w:t>
             </w:r>
           </w:p>
-          <w:p>
-            <w:pPr>
-              <w:rPr>
-                <w:rFonts w:ascii="Arial" w:hAnsi="Arial" w:cs="Arial"/>
-                <w:sz w:val="24"/>
-                <w:szCs w:val="24"/>
-              </w:rPr>
-            </w:pPr>
-          </w:p>
-          <w:p>
-            <w:pPr>
-              <w:rPr>
-                <w:rFonts w:ascii="Arial" w:hAnsi="Arial" w:cs="Arial"/>
-                <w:sz w:val="20"/>
-                <w:szCs w:val="20"/>
-              </w:rPr>
-            </w:pPr>
-          </w:p>
         </w:tc>
       </w:tr>
       <w:tr>
         <w:tc>
           <w:tcPr>
             <w:tcW w:w="4814" w:type="dxa"/>
+            <w:tcBorders>
+              <w:top w:val="none" w:sz="0" w:space="0" w:color="auto"/>
+              <w:left w:val="none" w:sz="0" w:space="0" w:color="auto"/>
+              <w:bottom w:val="none" w:sz="0" w:space="0" w:color="auto"/>
+              <w:right w:val="none" w:sz="0" w:space="0" w:color="auto"/>
+            </w:tcBorders>
           </w:tcPr>
           <w:p>
             <w:pPr>
@@ -3355,17 +3430,6 @@
               <w:jc w:val="center"/>
               <w:rPr>
                 <w:rFonts w:ascii="Arial" w:hAnsi="Arial" w:cs="Arial"/>
-                <w:b/>
-                <w:sz w:val="24"/>
-                <w:szCs w:val="24"/>
-              </w:rPr>
-            </w:pPr>
-          </w:p>
-          <w:p>
-            <w:pPr>
-              <w:jc w:val="center"/>
-              <w:rPr>
-                <w:rFonts w:ascii="Arial" w:hAnsi="Arial" w:cs="Arial"/>
                 <w:sz w:val="20"/>
                 <w:szCs w:val="20"/>
               </w:rPr>
@@ -3384,6 +3448,12 @@
         <w:tc>
           <w:tcPr>
             <w:tcW w:w="4814" w:type="dxa"/>
+            <w:tcBorders>
+              <w:top w:val="none" w:sz="0" w:space="0" w:color="auto"/>
+              <w:left w:val="none" w:sz="0" w:space="0" w:color="auto"/>
+              <w:bottom w:val="none" w:sz="0" w:space="0" w:color="auto"/>
+              <w:right w:val="none" w:sz="0" w:space="0" w:color="auto"/>
+            </w:tcBorders>
           </w:tcPr>
           <w:p>
             <w:pPr>
@@ -3410,17 +3480,6 @@
               <w:jc w:val="center"/>
               <w:rPr>
                 <w:rFonts w:ascii="Arial" w:hAnsi="Arial" w:cs="Arial"/>
-                <w:b/>
-                <w:sz w:val="24"/>
-                <w:szCs w:val="24"/>
-              </w:rPr>
-            </w:pPr>
-          </w:p>
-          <w:p>
-            <w:pPr>
-              <w:jc w:val="center"/>
-              <w:rPr>
-                <w:rFonts w:ascii="Arial" w:hAnsi="Arial" w:cs="Arial"/>
                 <w:sz w:val="20"/>
                 <w:szCs w:val="20"/>
               </w:rPr>
@@ -3455,6 +3514,7 @@
           <w:sz w:val="20"/>
           <w:szCs w:val="20"/>
         </w:rPr>
+        <w:spacing w:before="100" w:after="0"/>
       </w:pPr>
       <w:r>
         <w:rPr>
@@ -3512,17 +3572,11 @@
     </w:p>
     <w:p>
       <w:pPr>
-        <w:spacing w:before="89" w:line="360" w:lineRule="auto"/>
-        <w:ind w:left="899" w:right="899"/>
-        <w:contextualSpacing/>
-        <w:jc w:val="center"/>
-        <w:rPr>
-          <w:rFonts w:ascii="Times New Roman" w:hAnsi="Times New Roman" w:cs="Times New Roman"/>
-          <w:b/>
-          <w:sz w:val="28"/>
-          <w:szCs w:val="28"/>
-        </w:rPr>
-      </w:pPr>
+        <w:spacing w:before="0" w:after="0" w:line="240" w:lineRule="auto"/>
+      </w:pPr>
+      <w:r>
+        <w:br w:type="page"/>
+      </w:r>
     </w:p>
     <w:p>
       <w:pPr>
@@ -3833,142 +3887,11 @@
     </w:p>
     <w:p>
       <w:pPr>
-        <w:spacing w:before="100" w:beforeAutospacing="1" w:after="100" w:afterAutospacing="1" w:line="360" w:lineRule="auto"/>
-        <w:ind w:left="720"/>
-        <w:contextualSpacing/>
-        <w:jc w:val="both"/>
-        <w:rPr>
-          <w:rFonts w:ascii="Times New Roman" w:eastAsia="Times New Roman" w:hAnsi="Times New Roman" w:cs="Times New Roman"/>
-          <w:sz w:val="28"/>
-          <w:szCs w:val="28"/>
-        </w:rPr>
-      </w:pPr>
-    </w:p>
-    <w:p>
-      <w:pPr>
-        <w:spacing w:before="89" w:line="360" w:lineRule="auto"/>
-        <w:ind w:left="450" w:right="180"/>
-        <w:contextualSpacing/>
-        <w:jc w:val="center"/>
-        <w:rPr>
-          <w:rFonts w:ascii="Times New Roman" w:hAnsi="Times New Roman" w:cs="Times New Roman"/>
-          <w:b/>
-          <w:sz w:val="28"/>
-          <w:szCs w:val="28"/>
-        </w:rPr>
-      </w:pPr>
-    </w:p>
-    <w:p>
-      <w:pPr>
-        <w:spacing w:before="89" w:line="360" w:lineRule="auto"/>
-        <w:ind w:left="450" w:right="180"/>
-        <w:contextualSpacing/>
-        <w:jc w:val="center"/>
-        <w:rPr>
-          <w:rFonts w:ascii="Times New Roman" w:hAnsi="Times New Roman" w:cs="Times New Roman"/>
-          <w:b/>
-          <w:sz w:val="28"/>
-          <w:szCs w:val="28"/>
-        </w:rPr>
-      </w:pPr>
-    </w:p>
-    <w:p>
-      <w:pPr>
-        <w:spacing w:before="89" w:line="360" w:lineRule="auto"/>
-        <w:ind w:left="450" w:right="180"/>
-        <w:contextualSpacing/>
-        <w:jc w:val="center"/>
-        <w:rPr>
-          <w:rFonts w:ascii="Times New Roman" w:hAnsi="Times New Roman" w:cs="Times New Roman"/>
-          <w:b/>
-          <w:sz w:val="28"/>
-          <w:szCs w:val="28"/>
-        </w:rPr>
-      </w:pPr>
-    </w:p>
-    <w:p>
-      <w:pPr>
-        <w:spacing w:before="89" w:line="360" w:lineRule="auto"/>
-        <w:ind w:left="450" w:right="180"/>
-        <w:contextualSpacing/>
-        <w:jc w:val="center"/>
-        <w:rPr>
-          <w:rFonts w:ascii="Times New Roman" w:hAnsi="Times New Roman" w:cs="Times New Roman"/>
-          <w:b/>
-          <w:sz w:val="28"/>
-          <w:szCs w:val="28"/>
-        </w:rPr>
-      </w:pPr>
-    </w:p>
-    <w:p>
-      <w:pPr>
-        <w:spacing w:before="89" w:line="360" w:lineRule="auto"/>
-        <w:ind w:left="450" w:right="180"/>
-        <w:contextualSpacing/>
-        <w:jc w:val="center"/>
-        <w:rPr>
-          <w:rFonts w:ascii="Times New Roman" w:hAnsi="Times New Roman" w:cs="Times New Roman"/>
-          <w:b/>
-          <w:sz w:val="28"/>
-          <w:szCs w:val="28"/>
-        </w:rPr>
-      </w:pPr>
-    </w:p>
-    <w:p>
-      <w:pPr>
-        <w:spacing w:before="89" w:line="360" w:lineRule="auto"/>
-        <w:ind w:left="450" w:right="180"/>
-        <w:contextualSpacing/>
-        <w:jc w:val="center"/>
-        <w:rPr>
-          <w:rFonts w:ascii="Times New Roman" w:hAnsi="Times New Roman" w:cs="Times New Roman"/>
-          <w:b/>
-          <w:sz w:val="28"/>
-          <w:szCs w:val="28"/>
-        </w:rPr>
-      </w:pPr>
-    </w:p>
-    <w:p>
-      <w:pPr>
-        <w:spacing w:before="89" w:line="360" w:lineRule="auto"/>
-        <w:ind w:left="450" w:right="180"/>
-        <w:contextualSpacing/>
-        <w:jc w:val="center"/>
-        <w:rPr>
-          <w:rFonts w:ascii="Times New Roman" w:hAnsi="Times New Roman" w:cs="Times New Roman"/>
-          <w:b/>
-          <w:sz w:val="28"/>
-          <w:szCs w:val="28"/>
-        </w:rPr>
-      </w:pPr>
-    </w:p>
-    <w:p>
-      <w:pPr>
-        <w:spacing w:before="89" w:line="360" w:lineRule="auto"/>
-        <w:ind w:left="450" w:right="180"/>
-        <w:contextualSpacing/>
-        <w:jc w:val="center"/>
-        <w:rPr>
-          <w:rFonts w:ascii="Times New Roman" w:hAnsi="Times New Roman" w:cs="Times New Roman"/>
-          <w:b/>
-          <w:sz w:val="28"/>
-          <w:szCs w:val="28"/>
-        </w:rPr>
-      </w:pPr>
-    </w:p>
-    <w:p>
-      <w:pPr>
-        <w:spacing w:before="89" w:line="360" w:lineRule="auto"/>
-        <w:ind w:left="450" w:right="180"/>
-        <w:contextualSpacing/>
-        <w:jc w:val="center"/>
-        <w:rPr>
-          <w:rFonts w:ascii="Times New Roman" w:hAnsi="Times New Roman" w:cs="Times New Roman"/>
-          <w:b/>
-          <w:sz w:val="28"/>
-          <w:szCs w:val="28"/>
-        </w:rPr>
-      </w:pPr>
+        <w:spacing w:before="0" w:after="0" w:line="240" w:lineRule="auto"/>
+      </w:pPr>
+      <w:r>
+        <w:br w:type="page"/>
+      </w:r>
     </w:p>
     <w:p>
       <w:pPr>
@@ -4353,72 +4276,11 @@
     </w:p>
     <w:p>
       <w:pPr>
-        <w:spacing w:before="100" w:beforeAutospacing="1" w:after="100" w:afterAutospacing="1" w:line="360" w:lineRule="auto"/>
-        <w:ind w:left="360"/>
-        <w:contextualSpacing/>
-        <w:jc w:val="both"/>
-        <w:rPr>
-          <w:rFonts w:ascii="Times New Roman" w:eastAsia="Times New Roman" w:hAnsi="Times New Roman" w:cs="Times New Roman"/>
-          <w:sz w:val="28"/>
-          <w:szCs w:val="28"/>
-        </w:rPr>
-      </w:pPr>
-    </w:p>
-    <w:p>
-      <w:pPr>
-        <w:spacing w:before="100" w:beforeAutospacing="1" w:after="100" w:afterAutospacing="1" w:line="360" w:lineRule="auto"/>
-        <w:contextualSpacing/>
-        <w:jc w:val="center"/>
-        <w:rPr>
-          <w:rFonts w:ascii="Times New Roman" w:hAnsi="Times New Roman" w:cs="Times New Roman"/>
-          <w:b/>
-          <w:sz w:val="28"/>
-          <w:szCs w:val="28"/>
-          <w:u w:color="FF0000"/>
-        </w:rPr>
-      </w:pPr>
-    </w:p>
-    <w:p>
-      <w:pPr>
-        <w:spacing w:before="100" w:beforeAutospacing="1" w:after="100" w:afterAutospacing="1" w:line="360" w:lineRule="auto"/>
-        <w:contextualSpacing/>
-        <w:jc w:val="center"/>
-        <w:rPr>
-          <w:rFonts w:ascii="Times New Roman" w:hAnsi="Times New Roman" w:cs="Times New Roman"/>
-          <w:b/>
-          <w:sz w:val="28"/>
-          <w:szCs w:val="28"/>
-          <w:u w:color="FF0000"/>
-        </w:rPr>
-      </w:pPr>
-    </w:p>
-    <w:p>
-      <w:pPr>
-        <w:spacing w:before="100" w:beforeAutospacing="1" w:after="100" w:afterAutospacing="1" w:line="360" w:lineRule="auto"/>
-        <w:contextualSpacing/>
-        <w:jc w:val="center"/>
-        <w:rPr>
-          <w:rFonts w:ascii="Times New Roman" w:hAnsi="Times New Roman" w:cs="Times New Roman"/>
-          <w:b/>
-          <w:sz w:val="28"/>
-          <w:szCs w:val="28"/>
-          <w:u w:color="FF0000"/>
-        </w:rPr>
-      </w:pPr>
-    </w:p>
-    <w:p>
-      <w:pPr>
-        <w:spacing w:before="100" w:beforeAutospacing="1" w:after="100" w:afterAutospacing="1" w:line="360" w:lineRule="auto"/>
-        <w:contextualSpacing/>
-        <w:jc w:val="center"/>
-        <w:rPr>
-          <w:rFonts w:ascii="Times New Roman" w:hAnsi="Times New Roman" w:cs="Times New Roman"/>
-          <w:b/>
-          <w:sz w:val="28"/>
-          <w:szCs w:val="28"/>
-          <w:u w:color="FF0000"/>
-        </w:rPr>
-      </w:pPr>
+        <w:spacing w:before="0" w:after="0" w:line="240" w:lineRule="auto"/>
+      </w:pPr>
+      <w:r>
+        <w:br w:type="page"/>
+      </w:r>
     </w:p>
     <w:p>
       <w:pPr>

</xml_diff>